<commit_message>
format ai for flutter
</commit_message>
<xml_diff>
--- a/docs/PulmoAI_materialy_magisterska.docx
+++ b/docs/PulmoAI_materialy_magisterska.docx
@@ -8510,7 +8510,2393 @@
         <w:pStyle w:val="Heading1"/>
       </w:pPr>
       <w:r>
-        <w:t>9. Мобільний застосунок</w:t>
+        <w:t>9. Використання навченої моделі</w:t>
+      </w:r>
+    </w:p>
+    <w:p>
+      <w:pPr>
+        <w:spacing w:after="120"/>
+        <w:ind w:firstLine="709"/>
+        <w:jc w:val="both"/>
+      </w:pPr>
+      <w:r>
+        <w:rPr>
+          <w:b w:val="0"/>
+          <w:i w:val="0"/>
+        </w:rPr>
+        <w:t>Для практичного застосування навченої мережі реалізовано два інструменти: конвеєр висновування (inference) для одного рентгенівського знімка та візуалізацію ділянок зображення, які вплинули на рішення моделі. Обидва працюють із уже збереженою контрольною точкою best.pt (13-та епоха) у режимі лише читання: навчання не запускається, контрольна точка не змінюється, повторне оцінювання на тестовій вибірці не виконується.</w:t>
+      </w:r>
+    </w:p>
+    <w:p>
+      <w:pPr>
+        <w:pStyle w:val="Heading2"/>
+      </w:pPr>
+      <w:r>
+        <w:t>9.1. Конвеєр висновування</w:t>
+      </w:r>
+    </w:p>
+    <w:p>
+      <w:pPr>
+        <w:spacing w:after="120"/>
+        <w:ind w:firstLine="709"/>
+        <w:jc w:val="both"/>
+      </w:pPr>
+      <w:r>
+        <w:rPr>
+          <w:b w:val="0"/>
+          <w:i w:val="0"/>
+        </w:rPr>
+        <w:t>Модуль ai/src/inference/predict.py завантажує контрольну точку, переводить мережу в режим оцінювання, за наявності використовує графічний процесор, читає один файл DICOM, виконує попереднє оброблення, застосовує сигмоїду до вихідного логіта та повертає ймовірність, передбачений клас і використаний поріг.</w:t>
+      </w:r>
+    </w:p>
+    <w:p>
+      <w:pPr>
+        <w:spacing w:after="120"/>
+        <w:ind w:firstLine="709"/>
+        <w:jc w:val="both"/>
+      </w:pPr>
+      <w:r>
+        <w:rPr>
+          <w:b w:val="0"/>
+          <w:i w:val="0"/>
+        </w:rPr>
+        <w:t>Принципово важливо, що попереднє оброблення не реалізовано вдруге: модуль викликає ті самі функції з ai/src/data/preprocessing.py, які використовує клас Dataset під час навчання та оцінювання, у тому самому порядку та з тією самою конфігурацією, з вимкненою аугментацією. Автоматична перевірка порівнює тензор, отриманий конвеєром висновування, з тензором Dataset для того самого зображення й вимагає їх побітового збігу, тому розходження між двома шляхами оброблення неможливе.</w:t>
+      </w:r>
+    </w:p>
+    <w:p>
+      <w:pPr>
+        <w:spacing w:before="80" w:after="160" w:line="240" w:lineRule="auto"/>
+        <w:ind w:firstLine="0" w:left="340"/>
+      </w:pPr>
+      <w:r>
+        <w:rPr>
+          <w:rFonts w:ascii="Consolas" w:hAnsi="Consolas" w:eastAsia="Consolas"/>
+          <w:sz w:val="18"/>
+        </w:rPr>
+        <w:t>cd D:\pulmo_ai\ai</w:t>
+        <w:br/>
+        <w:t>..\ai\.venv\Scripts\python.exe -m src.inference.predict --dicom "&lt;файл.dcm&gt;"</w:t>
+        <w:br/>
+        <w:br/>
+        <w:t>Image       : ...8323329.10044.1517874346.509903.dcm</w:t>
+        <w:br/>
+        <w:t>Probability : 0.9802</w:t>
+        <w:br/>
+        <w:t>Prediction  : Pneumonia / Lung Opacity</w:t>
+        <w:br/>
+        <w:t>Threshold   : 0.50</w:t>
+      </w:r>
+    </w:p>
+    <w:p>
+      <w:pPr>
+        <w:spacing w:after="120"/>
+        <w:ind w:firstLine="709"/>
+        <w:jc w:val="both"/>
+      </w:pPr>
+      <w:r>
+        <w:rPr>
+          <w:b w:val="0"/>
+          <w:i w:val="0"/>
+        </w:rPr>
+        <w:t>Поріг за замовчуванням — 0,50, тобто значення, зафіксоване за валідаційною вибіркою до читання тестової. Ключ --json видає той самий результат у машинному форматі, що знадобиться під час інтеграції з мобільним застосунком.</w:t>
+      </w:r>
+    </w:p>
+    <w:p>
+      <w:pPr>
+        <w:pStyle w:val="Heading2"/>
+      </w:pPr>
+      <w:r>
+        <w:t>9.2. Візуалізація активацій (CAM)</w:t>
+      </w:r>
+    </w:p>
+    <w:p>
+      <w:pPr>
+        <w:spacing w:after="120"/>
+        <w:ind w:firstLine="709"/>
+        <w:jc w:val="both"/>
+      </w:pPr>
+      <w:r>
+        <w:rPr>
+          <w:b w:val="0"/>
+          <w:i w:val="0"/>
+        </w:rPr>
+        <w:t>Архітектура PulmoNet-7M завершується глобальним усередненням і лінійним шаром, тому вона природно підтримує метод карт активації класу (CAM, Zhou et al., 2016) без будь-яких змін у мережі та без обчислення градієнтів:</w:t>
+      </w:r>
+    </w:p>
+    <w:p>
+      <w:pPr>
+        <w:spacing w:before="80" w:after="160" w:line="240" w:lineRule="auto"/>
+        <w:ind w:firstLine="0" w:left="340"/>
+      </w:pPr>
+      <w:r>
+        <w:rPr>
+          <w:rFonts w:ascii="Consolas" w:hAnsi="Consolas" w:eastAsia="Consolas"/>
+          <w:sz w:val="18"/>
+        </w:rPr>
+        <w:t>features  = model.features(x)          # [1, 512, 7, 7]</w:t>
+        <w:br/>
+        <w:t>weights   = model.classifier.weight    # [1, 512]</w:t>
+        <w:br/>
+        <w:t>cam[y, x] = Σ_k weights[k] · features[k, y, x]</w:t>
+        <w:br/>
+        <w:t xml:space="preserve">            → ReLU → нормування на максимум → масштабування до 224×224</w:t>
+      </w:r>
+    </w:p>
+    <w:p>
+      <w:pPr>
+        <w:spacing w:after="120"/>
+        <w:ind w:firstLine="709"/>
+        <w:jc w:val="both"/>
+      </w:pPr>
+      <w:r>
+        <w:rPr>
+          <w:b w:val="0"/>
+          <w:i w:val="0"/>
+        </w:rPr>
+        <w:t>Модуль ai/src/analysis/cam.py для кожного зображення зберігає у каталозі ai/experiments/pulmonet7m-scratch/cam/&lt;SOPInstanceUID&gt;/ чотири файли: original.png (зображення, яке бачила мережа), heatmap.png (нормована карта активацій зі шкалою), overlay.png (накладення карти на знімок) і result.json з усіма параметрами запуску. Для позитивних випадків додатково зберігаються ground_truth_boxes.png та overlay_with_boxes.png.</w:t>
+      </w:r>
+    </w:p>
+    <w:p>
+      <w:pPr>
+        <w:pStyle w:val="Heading2"/>
+      </w:pPr>
+      <w:r>
+        <w:t>9.3. Перевірка на реальних знімках</w:t>
+      </w:r>
+    </w:p>
+    <w:p>
+      <w:pPr>
+        <w:spacing w:after="120"/>
+        <w:ind w:firstLine="709"/>
+        <w:jc w:val="both"/>
+      </w:pPr>
+      <w:r>
+        <w:rPr>
+          <w:b w:val="0"/>
+          <w:i w:val="0"/>
+        </w:rPr>
+        <w:t>Перевірку виконано на шести знімках із тестової вибірки — по два на кожен клас розмітки. Мітки використано виключно для опису результату; жодного налаштування моделі чи порога за ними не проводилося.</w:t>
+      </w:r>
+    </w:p>
+    <w:tbl>
+      <w:tblPr>
+        <w:tblStyle w:val="TableGrid"/>
+        <w:tblW w:type="auto" w:w="0"/>
+        <w:jc w:val="center"/>
+        <w:tblLook w:firstColumn="1" w:firstRow="1" w:lastColumn="0" w:lastRow="0" w:noHBand="0" w:noVBand="1" w:val="04A0"/>
+      </w:tblPr>
+      <w:tblGrid>
+        <w:gridCol w:w="1938"/>
+        <w:gridCol w:w="1938"/>
+        <w:gridCol w:w="1938"/>
+        <w:gridCol w:w="1938"/>
+        <w:gridCol w:w="1938"/>
+      </w:tblGrid>
+      <w:tr>
+        <w:tc>
+          <w:tcPr>
+            <w:tcW w:type="dxa" w:w="3118"/>
+            <w:shd w:val="clear" w:color="auto" w:fill="DCE6F1"/>
+          </w:tcPr>
+          <w:p>
+            <w:pPr>
+              <w:spacing w:after="0" w:line="240" w:lineRule="auto"/>
+              <w:ind w:firstLine="0"/>
+            </w:pPr>
+            <w:r/>
+            <w:r>
+              <w:rPr>
+                <w:b/>
+                <w:sz w:val="20"/>
+              </w:rPr>
+              <w:t>Істинний клас</w:t>
+            </w:r>
+          </w:p>
+        </w:tc>
+        <w:tc>
+          <w:tcPr>
+            <w:tcW w:type="dxa" w:w="1417"/>
+            <w:shd w:val="clear" w:color="auto" w:fill="DCE6F1"/>
+          </w:tcPr>
+          <w:p>
+            <w:pPr>
+              <w:spacing w:after="0" w:line="240" w:lineRule="auto"/>
+              <w:ind w:firstLine="0"/>
+            </w:pPr>
+            <w:r/>
+            <w:r>
+              <w:rPr>
+                <w:b/>
+                <w:sz w:val="20"/>
+              </w:rPr>
+              <w:t>Ідентифікатор</w:t>
+            </w:r>
+          </w:p>
+        </w:tc>
+        <w:tc>
+          <w:tcPr>
+            <w:tcW w:type="dxa" w:w="1304"/>
+            <w:shd w:val="clear" w:color="auto" w:fill="DCE6F1"/>
+          </w:tcPr>
+          <w:p>
+            <w:pPr>
+              <w:spacing w:after="0" w:line="240" w:lineRule="auto"/>
+              <w:ind w:firstLine="0"/>
+            </w:pPr>
+            <w:r/>
+            <w:r>
+              <w:rPr>
+                <w:b/>
+                <w:sz w:val="20"/>
+              </w:rPr>
+              <w:t>Імовірність</w:t>
+            </w:r>
+          </w:p>
+        </w:tc>
+        <w:tc>
+          <w:tcPr>
+            <w:tcW w:type="dxa" w:w="2381"/>
+            <w:shd w:val="clear" w:color="auto" w:fill="DCE6F1"/>
+          </w:tcPr>
+          <w:p>
+            <w:pPr>
+              <w:spacing w:after="0" w:line="240" w:lineRule="auto"/>
+              <w:ind w:firstLine="0"/>
+            </w:pPr>
+            <w:r/>
+            <w:r>
+              <w:rPr>
+                <w:b/>
+                <w:sz w:val="20"/>
+              </w:rPr>
+              <w:t>Передбачення</w:t>
+            </w:r>
+          </w:p>
+        </w:tc>
+        <w:tc>
+          <w:tcPr>
+            <w:tcW w:type="dxa" w:w="850"/>
+            <w:shd w:val="clear" w:color="auto" w:fill="DCE6F1"/>
+          </w:tcPr>
+          <w:p>
+            <w:pPr>
+              <w:spacing w:after="0" w:line="240" w:lineRule="auto"/>
+              <w:ind w:firstLine="0"/>
+            </w:pPr>
+            <w:r/>
+            <w:r>
+              <w:rPr>
+                <w:b/>
+                <w:sz w:val="20"/>
+              </w:rPr>
+              <w:t>Карта</w:t>
+            </w:r>
+          </w:p>
+        </w:tc>
+      </w:tr>
+      <w:tr>
+        <w:tc>
+          <w:tcPr>
+            <w:tcW w:type="dxa" w:w="3118"/>
+          </w:tcPr>
+          <w:p>
+            <w:pPr>
+              <w:spacing w:after="0" w:line="240" w:lineRule="auto"/>
+              <w:ind w:firstLine="0"/>
+            </w:pPr>
+            <w:r/>
+            <w:r>
+              <w:rPr>
+                <w:sz w:val="20"/>
+              </w:rPr>
+              <w:t>Lung Opacity</w:t>
+            </w:r>
+          </w:p>
+        </w:tc>
+        <w:tc>
+          <w:tcPr>
+            <w:tcW w:type="dxa" w:w="1417"/>
+          </w:tcPr>
+          <w:p>
+            <w:pPr>
+              <w:spacing w:after="0" w:line="240" w:lineRule="auto"/>
+              <w:ind w:firstLine="0"/>
+            </w:pPr>
+            <w:r/>
+            <w:r>
+              <w:rPr>
+                <w:sz w:val="20"/>
+              </w:rPr>
+              <w:t>…509903</w:t>
+            </w:r>
+          </w:p>
+        </w:tc>
+        <w:tc>
+          <w:tcPr>
+            <w:tcW w:type="dxa" w:w="1304"/>
+          </w:tcPr>
+          <w:p>
+            <w:pPr>
+              <w:spacing w:after="0" w:line="240" w:lineRule="auto"/>
+              <w:ind w:firstLine="0"/>
+            </w:pPr>
+            <w:r/>
+            <w:r>
+              <w:rPr>
+                <w:sz w:val="20"/>
+              </w:rPr>
+              <w:t>0,9802</w:t>
+            </w:r>
+          </w:p>
+        </w:tc>
+        <w:tc>
+          <w:tcPr>
+            <w:tcW w:type="dxa" w:w="2381"/>
+          </w:tcPr>
+          <w:p>
+            <w:pPr>
+              <w:spacing w:after="0" w:line="240" w:lineRule="auto"/>
+              <w:ind w:firstLine="0"/>
+            </w:pPr>
+            <w:r/>
+            <w:r>
+              <w:rPr>
+                <w:sz w:val="20"/>
+              </w:rPr>
+              <w:t>Pneumonia / Lung Opacity</w:t>
+            </w:r>
+          </w:p>
+        </w:tc>
+        <w:tc>
+          <w:tcPr>
+            <w:tcW w:type="dxa" w:w="850"/>
+          </w:tcPr>
+          <w:p>
+            <w:pPr>
+              <w:spacing w:after="0" w:line="240" w:lineRule="auto"/>
+              <w:ind w:firstLine="0"/>
+            </w:pPr>
+            <w:r/>
+            <w:r>
+              <w:rPr>
+                <w:sz w:val="20"/>
+              </w:rPr>
+              <w:t>так</w:t>
+            </w:r>
+          </w:p>
+        </w:tc>
+      </w:tr>
+      <w:tr>
+        <w:tc>
+          <w:tcPr>
+            <w:tcW w:type="dxa" w:w="3118"/>
+          </w:tcPr>
+          <w:p>
+            <w:pPr>
+              <w:spacing w:after="0" w:line="240" w:lineRule="auto"/>
+              <w:ind w:firstLine="0"/>
+            </w:pPr>
+            <w:r/>
+            <w:r>
+              <w:rPr>
+                <w:sz w:val="20"/>
+              </w:rPr>
+              <w:t>Lung Opacity</w:t>
+            </w:r>
+          </w:p>
+        </w:tc>
+        <w:tc>
+          <w:tcPr>
+            <w:tcW w:type="dxa" w:w="1417"/>
+          </w:tcPr>
+          <w:p>
+            <w:pPr>
+              <w:spacing w:after="0" w:line="240" w:lineRule="auto"/>
+              <w:ind w:firstLine="0"/>
+            </w:pPr>
+            <w:r/>
+            <w:r>
+              <w:rPr>
+                <w:sz w:val="20"/>
+              </w:rPr>
+              <w:t>…507388</w:t>
+            </w:r>
+          </w:p>
+        </w:tc>
+        <w:tc>
+          <w:tcPr>
+            <w:tcW w:type="dxa" w:w="1304"/>
+          </w:tcPr>
+          <w:p>
+            <w:pPr>
+              <w:spacing w:after="0" w:line="240" w:lineRule="auto"/>
+              <w:ind w:firstLine="0"/>
+            </w:pPr>
+            <w:r/>
+            <w:r>
+              <w:rPr>
+                <w:sz w:val="20"/>
+              </w:rPr>
+              <w:t>0,8095</w:t>
+            </w:r>
+          </w:p>
+        </w:tc>
+        <w:tc>
+          <w:tcPr>
+            <w:tcW w:type="dxa" w:w="2381"/>
+          </w:tcPr>
+          <w:p>
+            <w:pPr>
+              <w:spacing w:after="0" w:line="240" w:lineRule="auto"/>
+              <w:ind w:firstLine="0"/>
+            </w:pPr>
+            <w:r/>
+            <w:r>
+              <w:rPr>
+                <w:sz w:val="20"/>
+              </w:rPr>
+              <w:t>Pneumonia / Lung Opacity</w:t>
+            </w:r>
+          </w:p>
+        </w:tc>
+        <w:tc>
+          <w:tcPr>
+            <w:tcW w:type="dxa" w:w="850"/>
+          </w:tcPr>
+          <w:p>
+            <w:pPr>
+              <w:spacing w:after="0" w:line="240" w:lineRule="auto"/>
+              <w:ind w:firstLine="0"/>
+            </w:pPr>
+            <w:r/>
+            <w:r>
+              <w:rPr>
+                <w:sz w:val="20"/>
+              </w:rPr>
+              <w:t>так</w:t>
+            </w:r>
+          </w:p>
+        </w:tc>
+      </w:tr>
+      <w:tr>
+        <w:tc>
+          <w:tcPr>
+            <w:tcW w:type="dxa" w:w="3118"/>
+          </w:tcPr>
+          <w:p>
+            <w:pPr>
+              <w:spacing w:after="0" w:line="240" w:lineRule="auto"/>
+              <w:ind w:firstLine="0"/>
+            </w:pPr>
+            <w:r/>
+            <w:r>
+              <w:rPr>
+                <w:sz w:val="20"/>
+              </w:rPr>
+              <w:t>Normal</w:t>
+            </w:r>
+          </w:p>
+        </w:tc>
+        <w:tc>
+          <w:tcPr>
+            <w:tcW w:type="dxa" w:w="1417"/>
+          </w:tcPr>
+          <w:p>
+            <w:pPr>
+              <w:spacing w:after="0" w:line="240" w:lineRule="auto"/>
+              <w:ind w:firstLine="0"/>
+            </w:pPr>
+            <w:r/>
+            <w:r>
+              <w:rPr>
+                <w:sz w:val="20"/>
+              </w:rPr>
+              <w:t>…287366</w:t>
+            </w:r>
+          </w:p>
+        </w:tc>
+        <w:tc>
+          <w:tcPr>
+            <w:tcW w:type="dxa" w:w="1304"/>
+          </w:tcPr>
+          <w:p>
+            <w:pPr>
+              <w:spacing w:after="0" w:line="240" w:lineRule="auto"/>
+              <w:ind w:firstLine="0"/>
+            </w:pPr>
+            <w:r/>
+            <w:r>
+              <w:rPr>
+                <w:sz w:val="20"/>
+              </w:rPr>
+              <w:t>0,0179</w:t>
+            </w:r>
+          </w:p>
+        </w:tc>
+        <w:tc>
+          <w:tcPr>
+            <w:tcW w:type="dxa" w:w="2381"/>
+          </w:tcPr>
+          <w:p>
+            <w:pPr>
+              <w:spacing w:after="0" w:line="240" w:lineRule="auto"/>
+              <w:ind w:firstLine="0"/>
+            </w:pPr>
+            <w:r/>
+            <w:r>
+              <w:rPr>
+                <w:sz w:val="20"/>
+              </w:rPr>
+              <w:t>No Pneumonia</w:t>
+            </w:r>
+          </w:p>
+        </w:tc>
+        <w:tc>
+          <w:tcPr>
+            <w:tcW w:type="dxa" w:w="850"/>
+          </w:tcPr>
+          <w:p>
+            <w:pPr>
+              <w:spacing w:after="0" w:line="240" w:lineRule="auto"/>
+              <w:ind w:firstLine="0"/>
+            </w:pPr>
+            <w:r/>
+            <w:r>
+              <w:rPr>
+                <w:sz w:val="20"/>
+              </w:rPr>
+              <w:t>так</w:t>
+            </w:r>
+          </w:p>
+        </w:tc>
+      </w:tr>
+      <w:tr>
+        <w:tc>
+          <w:tcPr>
+            <w:tcW w:type="dxa" w:w="3118"/>
+          </w:tcPr>
+          <w:p>
+            <w:pPr>
+              <w:spacing w:after="0" w:line="240" w:lineRule="auto"/>
+              <w:ind w:firstLine="0"/>
+            </w:pPr>
+            <w:r/>
+            <w:r>
+              <w:rPr>
+                <w:sz w:val="20"/>
+              </w:rPr>
+              <w:t>Normal</w:t>
+            </w:r>
+          </w:p>
+        </w:tc>
+        <w:tc>
+          <w:tcPr>
+            <w:tcW w:type="dxa" w:w="1417"/>
+          </w:tcPr>
+          <w:p>
+            <w:pPr>
+              <w:spacing w:after="0" w:line="240" w:lineRule="auto"/>
+              <w:ind w:firstLine="0"/>
+            </w:pPr>
+            <w:r/>
+            <w:r>
+              <w:rPr>
+                <w:sz w:val="20"/>
+              </w:rPr>
+              <w:t>…448931</w:t>
+            </w:r>
+          </w:p>
+        </w:tc>
+        <w:tc>
+          <w:tcPr>
+            <w:tcW w:type="dxa" w:w="1304"/>
+          </w:tcPr>
+          <w:p>
+            <w:pPr>
+              <w:spacing w:after="0" w:line="240" w:lineRule="auto"/>
+              <w:ind w:firstLine="0"/>
+            </w:pPr>
+            <w:r/>
+            <w:r>
+              <w:rPr>
+                <w:sz w:val="20"/>
+              </w:rPr>
+              <w:t>0,0132</w:t>
+            </w:r>
+          </w:p>
+        </w:tc>
+        <w:tc>
+          <w:tcPr>
+            <w:tcW w:type="dxa" w:w="2381"/>
+          </w:tcPr>
+          <w:p>
+            <w:pPr>
+              <w:spacing w:after="0" w:line="240" w:lineRule="auto"/>
+              <w:ind w:firstLine="0"/>
+            </w:pPr>
+            <w:r/>
+            <w:r>
+              <w:rPr>
+                <w:sz w:val="20"/>
+              </w:rPr>
+              <w:t>No Pneumonia</w:t>
+            </w:r>
+          </w:p>
+        </w:tc>
+        <w:tc>
+          <w:tcPr>
+            <w:tcW w:type="dxa" w:w="850"/>
+          </w:tcPr>
+          <w:p>
+            <w:pPr>
+              <w:spacing w:after="0" w:line="240" w:lineRule="auto"/>
+              <w:ind w:firstLine="0"/>
+            </w:pPr>
+            <w:r/>
+            <w:r>
+              <w:rPr>
+                <w:sz w:val="20"/>
+              </w:rPr>
+              <w:t>так</w:t>
+            </w:r>
+          </w:p>
+        </w:tc>
+      </w:tr>
+      <w:tr>
+        <w:tc>
+          <w:tcPr>
+            <w:tcW w:type="dxa" w:w="3118"/>
+          </w:tcPr>
+          <w:p>
+            <w:pPr>
+              <w:spacing w:after="0" w:line="240" w:lineRule="auto"/>
+              <w:ind w:firstLine="0"/>
+            </w:pPr>
+            <w:r/>
+            <w:r>
+              <w:rPr>
+                <w:sz w:val="20"/>
+              </w:rPr>
+              <w:t>No Lung Opacity / Not Normal</w:t>
+            </w:r>
+          </w:p>
+        </w:tc>
+        <w:tc>
+          <w:tcPr>
+            <w:tcW w:type="dxa" w:w="1417"/>
+          </w:tcPr>
+          <w:p>
+            <w:pPr>
+              <w:spacing w:after="0" w:line="240" w:lineRule="auto"/>
+              <w:ind w:firstLine="0"/>
+            </w:pPr>
+            <w:r/>
+            <w:r>
+              <w:rPr>
+                <w:sz w:val="20"/>
+              </w:rPr>
+              <w:t>…294012</w:t>
+            </w:r>
+          </w:p>
+        </w:tc>
+        <w:tc>
+          <w:tcPr>
+            <w:tcW w:type="dxa" w:w="1304"/>
+          </w:tcPr>
+          <w:p>
+            <w:pPr>
+              <w:spacing w:after="0" w:line="240" w:lineRule="auto"/>
+              <w:ind w:firstLine="0"/>
+            </w:pPr>
+            <w:r/>
+            <w:r>
+              <w:rPr>
+                <w:sz w:val="20"/>
+              </w:rPr>
+              <w:t>0,3126</w:t>
+            </w:r>
+          </w:p>
+        </w:tc>
+        <w:tc>
+          <w:tcPr>
+            <w:tcW w:type="dxa" w:w="2381"/>
+          </w:tcPr>
+          <w:p>
+            <w:pPr>
+              <w:spacing w:after="0" w:line="240" w:lineRule="auto"/>
+              <w:ind w:firstLine="0"/>
+            </w:pPr>
+            <w:r/>
+            <w:r>
+              <w:rPr>
+                <w:sz w:val="20"/>
+              </w:rPr>
+              <w:t>No Pneumonia</w:t>
+            </w:r>
+          </w:p>
+        </w:tc>
+        <w:tc>
+          <w:tcPr>
+            <w:tcW w:type="dxa" w:w="850"/>
+          </w:tcPr>
+          <w:p>
+            <w:pPr>
+              <w:spacing w:after="0" w:line="240" w:lineRule="auto"/>
+              <w:ind w:firstLine="0"/>
+            </w:pPr>
+            <w:r/>
+            <w:r>
+              <w:rPr>
+                <w:sz w:val="20"/>
+              </w:rPr>
+              <w:t>так</w:t>
+            </w:r>
+          </w:p>
+        </w:tc>
+      </w:tr>
+      <w:tr>
+        <w:tc>
+          <w:tcPr>
+            <w:tcW w:type="dxa" w:w="3118"/>
+          </w:tcPr>
+          <w:p>
+            <w:pPr>
+              <w:spacing w:after="0" w:line="240" w:lineRule="auto"/>
+              <w:ind w:firstLine="0"/>
+            </w:pPr>
+            <w:r/>
+            <w:r>
+              <w:rPr>
+                <w:sz w:val="20"/>
+              </w:rPr>
+              <w:t>No Lung Opacity / Not Normal</w:t>
+            </w:r>
+          </w:p>
+        </w:tc>
+        <w:tc>
+          <w:tcPr>
+            <w:tcW w:type="dxa" w:w="1417"/>
+          </w:tcPr>
+          <w:p>
+            <w:pPr>
+              <w:spacing w:after="0" w:line="240" w:lineRule="auto"/>
+              <w:ind w:firstLine="0"/>
+            </w:pPr>
+            <w:r/>
+            <w:r>
+              <w:rPr>
+                <w:sz w:val="20"/>
+              </w:rPr>
+              <w:t>…191950</w:t>
+            </w:r>
+          </w:p>
+        </w:tc>
+        <w:tc>
+          <w:tcPr>
+            <w:tcW w:type="dxa" w:w="1304"/>
+          </w:tcPr>
+          <w:p>
+            <w:pPr>
+              <w:spacing w:after="0" w:line="240" w:lineRule="auto"/>
+              <w:ind w:firstLine="0"/>
+            </w:pPr>
+            <w:r/>
+            <w:r>
+              <w:rPr>
+                <w:sz w:val="20"/>
+              </w:rPr>
+              <w:t>0,6077</w:t>
+            </w:r>
+          </w:p>
+        </w:tc>
+        <w:tc>
+          <w:tcPr>
+            <w:tcW w:type="dxa" w:w="2381"/>
+          </w:tcPr>
+          <w:p>
+            <w:pPr>
+              <w:spacing w:after="0" w:line="240" w:lineRule="auto"/>
+              <w:ind w:firstLine="0"/>
+            </w:pPr>
+            <w:r/>
+            <w:r>
+              <w:rPr>
+                <w:sz w:val="20"/>
+              </w:rPr>
+              <w:t>Pneumonia / Lung Opacity</w:t>
+            </w:r>
+          </w:p>
+        </w:tc>
+        <w:tc>
+          <w:tcPr>
+            <w:tcW w:type="dxa" w:w="850"/>
+          </w:tcPr>
+          <w:p>
+            <w:pPr>
+              <w:spacing w:after="0" w:line="240" w:lineRule="auto"/>
+              <w:ind w:firstLine="0"/>
+            </w:pPr>
+            <w:r/>
+            <w:r>
+              <w:rPr>
+                <w:sz w:val="20"/>
+              </w:rPr>
+              <w:t>так</w:t>
+            </w:r>
+          </w:p>
+        </w:tc>
+      </w:tr>
+    </w:tbl>
+    <w:p>
+      <w:pPr>
+        <w:spacing w:after="0"/>
+      </w:pPr>
+    </w:p>
+    <w:p>
+      <w:pPr>
+        <w:spacing w:before="40" w:after="200" w:line="240" w:lineRule="auto"/>
+        <w:ind w:firstLine="0"/>
+      </w:pPr>
+      <w:r>
+        <w:rPr>
+          <w:i/>
+          <w:sz w:val="22"/>
+        </w:rPr>
+        <w:t>Таблиця 9.1 — Результати висновування на шести знімках тестової вибірки (поріг 0,50). Помилок оброблення не виникло.</w:t>
+      </w:r>
+    </w:p>
+    <w:p>
+      <w:pPr>
+        <w:spacing w:after="120"/>
+        <w:ind w:firstLine="709"/>
+        <w:jc w:val="both"/>
+      </w:pPr>
+      <w:r>
+        <w:rPr>
+          <w:b w:val="0"/>
+          <w:i w:val="0"/>
+        </w:rPr>
+        <w:t>П’ять із шести знімків класифіковано правильно. Єдина помилка — хибна тривога на знімку класу «No Lung Opacity / Not Normal» (0,6077), що узгоджується із загальною структурою помилок, описаною в підрозділі 8.4: саме цей клас дає 96 % усіх хибно позитивних відповідей.</w:t>
+      </w:r>
+    </w:p>
+    <w:p>
+      <w:pPr>
+        <w:spacing w:before="160" w:after="40"/>
+        <w:ind w:firstLine="0"/>
+        <w:jc w:val="center"/>
+      </w:pPr>
+      <w:r>
+        <w:drawing>
+          <wp:inline xmlns:a="http://schemas.openxmlformats.org/drawingml/2006/main" xmlns:pic="http://schemas.openxmlformats.org/drawingml/2006/picture">
+            <wp:extent cx="3780000" cy="3952667"/>
+            <wp:docPr id="9" name="Picture 9"/>
+            <wp:cNvGraphicFramePr>
+              <a:graphicFrameLocks noChangeAspect="1"/>
+            </wp:cNvGraphicFramePr>
+            <a:graphic>
+              <a:graphicData uri="http://schemas.openxmlformats.org/drawingml/2006/picture">
+                <pic:pic>
+                  <pic:nvPicPr>
+                    <pic:cNvPr id="0" name="overlay.png"/>
+                    <pic:cNvPicPr/>
+                  </pic:nvPicPr>
+                  <pic:blipFill>
+                    <a:blip r:embed="rId18"/>
+                    <a:stretch>
+                      <a:fillRect/>
+                    </a:stretch>
+                  </pic:blipFill>
+                  <pic:spPr>
+                    <a:xfrm>
+                      <a:off x="0" y="0"/>
+                      <a:ext cx="3780000" cy="3952667"/>
+                    </a:xfrm>
+                    <a:prstGeom prst="rect"/>
+                  </pic:spPr>
+                </pic:pic>
+              </a:graphicData>
+            </a:graphic>
+          </wp:inline>
+        </w:drawing>
+      </w:r>
+    </w:p>
+    <w:p>
+      <w:pPr>
+        <w:spacing w:after="240" w:line="240" w:lineRule="auto"/>
+        <w:ind w:firstLine="0"/>
+        <w:jc w:val="center"/>
+      </w:pPr>
+      <w:r>
+        <w:rPr>
+          <w:i/>
+          <w:sz w:val="22"/>
+        </w:rPr>
+        <w:t>Рисунок 9.1 — Накладення карти активацій на рентгенограму класу Lung Opacity (передбачена ймовірність 0,980).</w:t>
+      </w:r>
+    </w:p>
+    <w:p>
+      <w:pPr>
+        <w:spacing w:before="160" w:after="40"/>
+        <w:ind w:firstLine="0"/>
+        <w:jc w:val="center"/>
+      </w:pPr>
+      <w:r>
+        <w:drawing>
+          <wp:inline xmlns:a="http://schemas.openxmlformats.org/drawingml/2006/main" xmlns:pic="http://schemas.openxmlformats.org/drawingml/2006/picture">
+            <wp:extent cx="3780000" cy="3952667"/>
+            <wp:docPr id="10" name="Picture 10"/>
+            <wp:cNvGraphicFramePr>
+              <a:graphicFrameLocks noChangeAspect="1"/>
+            </wp:cNvGraphicFramePr>
+            <a:graphic>
+              <a:graphicData uri="http://schemas.openxmlformats.org/drawingml/2006/picture">
+                <pic:pic>
+                  <pic:nvPicPr>
+                    <pic:cNvPr id="0" name="overlay.png"/>
+                    <pic:cNvPicPr/>
+                  </pic:nvPicPr>
+                  <pic:blipFill>
+                    <a:blip r:embed="rId19"/>
+                    <a:stretch>
+                      <a:fillRect/>
+                    </a:stretch>
+                  </pic:blipFill>
+                  <pic:spPr>
+                    <a:xfrm>
+                      <a:off x="0" y="0"/>
+                      <a:ext cx="3780000" cy="3952667"/>
+                    </a:xfrm>
+                    <a:prstGeom prst="rect"/>
+                  </pic:spPr>
+                </pic:pic>
+              </a:graphicData>
+            </a:graphic>
+          </wp:inline>
+        </w:drawing>
+      </w:r>
+    </w:p>
+    <w:p>
+      <w:pPr>
+        <w:spacing w:after="240" w:line="240" w:lineRule="auto"/>
+        <w:ind w:firstLine="0"/>
+        <w:jc w:val="center"/>
+      </w:pPr>
+      <w:r>
+        <w:rPr>
+          <w:i/>
+          <w:sz w:val="22"/>
+        </w:rPr>
+        <w:t>Рисунок 9.2 — Те саме для знімка класу Normal (ймовірність 0,018). Карта нормується на власний максимум, тому яскрава ділянка присутня навіть за низької ймовірності — яскравість є відносною в межах одного зображення.</w:t>
+      </w:r>
+    </w:p>
+    <w:p>
+      <w:pPr>
+        <w:pStyle w:val="Heading2"/>
+      </w:pPr>
+      <w:r>
+        <w:t>9.4. Зіставлення карти активацій з розміткою</w:t>
+      </w:r>
+    </w:p>
+    <w:p>
+      <w:pPr>
+        <w:spacing w:after="120"/>
+        <w:ind w:firstLine="709"/>
+        <w:jc w:val="both"/>
+      </w:pPr>
+      <w:r>
+        <w:rPr>
+          <w:b w:val="0"/>
+          <w:i w:val="0"/>
+        </w:rPr>
+        <w:t>Для позитивних випадків карту активацій зіставлено з узгодженими обмежувальними рамками з файлу bounding_boxes.csv. Рамки використано **виключно для опису візуалізації** — ані для навчання, ані для добору порога, ані для будь-якого налаштування моделі.</w:t>
+      </w:r>
+    </w:p>
+    <w:p>
+      <w:pPr>
+        <w:spacing w:before="160" w:after="40"/>
+        <w:ind w:firstLine="0"/>
+        <w:jc w:val="center"/>
+      </w:pPr>
+      <w:r>
+        <w:drawing>
+          <wp:inline xmlns:a="http://schemas.openxmlformats.org/drawingml/2006/main" xmlns:pic="http://schemas.openxmlformats.org/drawingml/2006/picture">
+            <wp:extent cx="3780000" cy="3952667"/>
+            <wp:docPr id="11" name="Picture 11"/>
+            <wp:cNvGraphicFramePr>
+              <a:graphicFrameLocks noChangeAspect="1"/>
+            </wp:cNvGraphicFramePr>
+            <a:graphic>
+              <a:graphicData uri="http://schemas.openxmlformats.org/drawingml/2006/picture">
+                <pic:pic>
+                  <pic:nvPicPr>
+                    <pic:cNvPr id="0" name="overlay_with_boxes.png"/>
+                    <pic:cNvPicPr/>
+                  </pic:nvPicPr>
+                  <pic:blipFill>
+                    <a:blip r:embed="rId20"/>
+                    <a:stretch>
+                      <a:fillRect/>
+                    </a:stretch>
+                  </pic:blipFill>
+                  <pic:spPr>
+                    <a:xfrm>
+                      <a:off x="0" y="0"/>
+                      <a:ext cx="3780000" cy="3952667"/>
+                    </a:xfrm>
+                    <a:prstGeom prst="rect"/>
+                  </pic:spPr>
+                </pic:pic>
+              </a:graphicData>
+            </a:graphic>
+          </wp:inline>
+        </w:drawing>
+      </w:r>
+    </w:p>
+    <w:p>
+      <w:pPr>
+        <w:spacing w:after="240" w:line="240" w:lineRule="auto"/>
+        <w:ind w:firstLine="0"/>
+        <w:jc w:val="center"/>
+      </w:pPr>
+      <w:r>
+        <w:rPr>
+          <w:i/>
+          <w:sz w:val="22"/>
+        </w:rPr>
+        <w:t>Рисунок 9.3 — Карта активацій і узгоджені обмежувальні рамки (ймовірність 0,980). Найактивніша ділянка збігається з правою за зображенням рамкою.</w:t>
+      </w:r>
+    </w:p>
+    <w:p>
+      <w:pPr>
+        <w:spacing w:before="160" w:after="40"/>
+        <w:ind w:firstLine="0"/>
+        <w:jc w:val="center"/>
+      </w:pPr>
+      <w:r>
+        <w:drawing>
+          <wp:inline xmlns:a="http://schemas.openxmlformats.org/drawingml/2006/main" xmlns:pic="http://schemas.openxmlformats.org/drawingml/2006/picture">
+            <wp:extent cx="3780000" cy="3952667"/>
+            <wp:docPr id="12" name="Picture 12"/>
+            <wp:cNvGraphicFramePr>
+              <a:graphicFrameLocks noChangeAspect="1"/>
+            </wp:cNvGraphicFramePr>
+            <a:graphic>
+              <a:graphicData uri="http://schemas.openxmlformats.org/drawingml/2006/picture">
+                <pic:pic>
+                  <pic:nvPicPr>
+                    <pic:cNvPr id="0" name="overlay_with_boxes.png"/>
+                    <pic:cNvPicPr/>
+                  </pic:nvPicPr>
+                  <pic:blipFill>
+                    <a:blip r:embed="rId21"/>
+                    <a:stretch>
+                      <a:fillRect/>
+                    </a:stretch>
+                  </pic:blipFill>
+                  <pic:spPr>
+                    <a:xfrm>
+                      <a:off x="0" y="0"/>
+                      <a:ext cx="3780000" cy="3952667"/>
+                    </a:xfrm>
+                    <a:prstGeom prst="rect"/>
+                  </pic:spPr>
+                </pic:pic>
+              </a:graphicData>
+            </a:graphic>
+          </wp:inline>
+        </w:drawing>
+      </w:r>
+    </w:p>
+    <w:p>
+      <w:pPr>
+        <w:spacing w:after="240" w:line="240" w:lineRule="auto"/>
+        <w:ind w:firstLine="0"/>
+        <w:jc w:val="center"/>
+      </w:pPr>
+      <w:r>
+        <w:rPr>
+          <w:i/>
+          <w:sz w:val="22"/>
+        </w:rPr>
+        <w:t>Рисунок 9.4 — Той самий вигляд для другого позитивного знімка (ймовірність 0,810).</w:t>
+      </w:r>
+    </w:p>
+    <w:p>
+      <w:pPr>
+        <w:spacing w:after="120"/>
+        <w:ind w:firstLine="709"/>
+        <w:jc w:val="both"/>
+      </w:pPr>
+      <w:r>
+        <w:rPr>
+          <w:b w:val="0"/>
+          <w:i w:val="0"/>
+        </w:rPr>
+        <w:t>Кількісне зіставлення виконано двома простими показниками, визначеними заздалегідь і не підібраними за жодною вибіркою:</w:t>
+      </w:r>
+    </w:p>
+    <w:p>
+      <w:pPr>
+        <w:pStyle w:val="ListBullet"/>
+      </w:pPr>
+      <w:r>
+        <w:rPr>
+          <w:b/>
+        </w:rPr>
+        <w:t xml:space="preserve">Влучання максимуму — </w:t>
+      </w:r>
+      <w:r>
+        <w:t>чи потрапляє найяскравіший піксель карти всередину розміченої рамки. Показник не потребує порога.</w:t>
+      </w:r>
+    </w:p>
+    <w:p>
+      <w:pPr>
+        <w:pStyle w:val="ListBullet"/>
+      </w:pPr>
+      <w:r>
+        <w:rPr>
+          <w:b/>
+        </w:rPr>
+        <w:t xml:space="preserve">IoU за правилом 0,5·max — </w:t>
+      </w:r>
+      <w:r>
+        <w:t>відношення перетину до об’єднання між об’єднанням рамок і картою, бінаризованою за порогом 0,5 від її власного максимуму. Це стандартне правило локалізації з оригінальної статті про CAM.</w:t>
+      </w:r>
+    </w:p>
+    <w:tbl>
+      <w:tblPr>
+        <w:tblStyle w:val="TableGrid"/>
+        <w:tblW w:type="auto" w:w="0"/>
+        <w:jc w:val="center"/>
+        <w:tblLook w:firstColumn="1" w:firstRow="1" w:lastColumn="0" w:lastRow="0" w:noHBand="0" w:noVBand="1" w:val="04A0"/>
+      </w:tblPr>
+      <w:tblGrid>
+        <w:gridCol w:w="1615"/>
+        <w:gridCol w:w="1615"/>
+        <w:gridCol w:w="1615"/>
+        <w:gridCol w:w="1615"/>
+        <w:gridCol w:w="1615"/>
+        <w:gridCol w:w="1615"/>
+      </w:tblGrid>
+      <w:tr>
+        <w:tc>
+          <w:tcPr>
+            <w:tcW w:type="dxa" w:w="1417"/>
+            <w:shd w:val="clear" w:color="auto" w:fill="DCE6F1"/>
+          </w:tcPr>
+          <w:p>
+            <w:pPr>
+              <w:spacing w:after="0" w:line="240" w:lineRule="auto"/>
+              <w:ind w:firstLine="0"/>
+            </w:pPr>
+            <w:r/>
+            <w:r>
+              <w:rPr>
+                <w:b/>
+                <w:sz w:val="20"/>
+              </w:rPr>
+              <w:t>Знімок</w:t>
+            </w:r>
+          </w:p>
+        </w:tc>
+        <w:tc>
+          <w:tcPr>
+            <w:tcW w:type="dxa" w:w="1417"/>
+            <w:shd w:val="clear" w:color="auto" w:fill="DCE6F1"/>
+          </w:tcPr>
+          <w:p>
+            <w:pPr>
+              <w:spacing w:after="0" w:line="240" w:lineRule="auto"/>
+              <w:ind w:firstLine="0"/>
+            </w:pPr>
+            <w:r/>
+            <w:r>
+              <w:rPr>
+                <w:b/>
+                <w:sz w:val="20"/>
+              </w:rPr>
+              <w:t>Імовірність</w:t>
+            </w:r>
+          </w:p>
+        </w:tc>
+        <w:tc>
+          <w:tcPr>
+            <w:tcW w:type="dxa" w:w="1020"/>
+            <w:shd w:val="clear" w:color="auto" w:fill="DCE6F1"/>
+          </w:tcPr>
+          <w:p>
+            <w:pPr>
+              <w:spacing w:after="0" w:line="240" w:lineRule="auto"/>
+              <w:ind w:firstLine="0"/>
+            </w:pPr>
+            <w:r/>
+            <w:r>
+              <w:rPr>
+                <w:b/>
+                <w:sz w:val="20"/>
+              </w:rPr>
+              <w:t>Рамок</w:t>
+            </w:r>
+          </w:p>
+        </w:tc>
+        <w:tc>
+          <w:tcPr>
+            <w:tcW w:type="dxa" w:w="1587"/>
+            <w:shd w:val="clear" w:color="auto" w:fill="DCE6F1"/>
+          </w:tcPr>
+          <w:p>
+            <w:pPr>
+              <w:spacing w:after="0" w:line="240" w:lineRule="auto"/>
+              <w:ind w:firstLine="0"/>
+            </w:pPr>
+            <w:r/>
+            <w:r>
+              <w:rPr>
+                <w:b/>
+                <w:sz w:val="20"/>
+              </w:rPr>
+              <w:t>IoU@0,5·max</w:t>
+            </w:r>
+          </w:p>
+        </w:tc>
+        <w:tc>
+          <w:tcPr>
+            <w:tcW w:type="dxa" w:w="1814"/>
+            <w:shd w:val="clear" w:color="auto" w:fill="DCE6F1"/>
+          </w:tcPr>
+          <w:p>
+            <w:pPr>
+              <w:spacing w:after="0" w:line="240" w:lineRule="auto"/>
+              <w:ind w:firstLine="0"/>
+            </w:pPr>
+            <w:r/>
+            <w:r>
+              <w:rPr>
+                <w:b/>
+                <w:sz w:val="20"/>
+              </w:rPr>
+              <w:t>Влучання максимуму</w:t>
+            </w:r>
+          </w:p>
+        </w:tc>
+        <w:tc>
+          <w:tcPr>
+            <w:tcW w:type="dxa" w:w="1984"/>
+            <w:shd w:val="clear" w:color="auto" w:fill="DCE6F1"/>
+          </w:tcPr>
+          <w:p>
+            <w:pPr>
+              <w:spacing w:after="0" w:line="240" w:lineRule="auto"/>
+              <w:ind w:firstLine="0"/>
+            </w:pPr>
+            <w:r/>
+            <w:r>
+              <w:rPr>
+                <w:b/>
+                <w:sz w:val="20"/>
+              </w:rPr>
+              <w:t>Частка кадру під картою</w:t>
+            </w:r>
+          </w:p>
+        </w:tc>
+      </w:tr>
+      <w:tr>
+        <w:tc>
+          <w:tcPr>
+            <w:tcW w:type="dxa" w:w="1417"/>
+          </w:tcPr>
+          <w:p>
+            <w:pPr>
+              <w:spacing w:after="0" w:line="240" w:lineRule="auto"/>
+              <w:ind w:firstLine="0"/>
+            </w:pPr>
+            <w:r/>
+            <w:r>
+              <w:rPr>
+                <w:sz w:val="20"/>
+              </w:rPr>
+              <w:t>…509903</w:t>
+            </w:r>
+          </w:p>
+        </w:tc>
+        <w:tc>
+          <w:tcPr>
+            <w:tcW w:type="dxa" w:w="1417"/>
+          </w:tcPr>
+          <w:p>
+            <w:pPr>
+              <w:spacing w:after="0" w:line="240" w:lineRule="auto"/>
+              <w:ind w:firstLine="0"/>
+            </w:pPr>
+            <w:r/>
+            <w:r>
+              <w:rPr>
+                <w:sz w:val="20"/>
+              </w:rPr>
+              <w:t>0,9802</w:t>
+            </w:r>
+          </w:p>
+        </w:tc>
+        <w:tc>
+          <w:tcPr>
+            <w:tcW w:type="dxa" w:w="1020"/>
+          </w:tcPr>
+          <w:p>
+            <w:pPr>
+              <w:spacing w:after="0" w:line="240" w:lineRule="auto"/>
+              <w:ind w:firstLine="0"/>
+            </w:pPr>
+            <w:r/>
+            <w:r>
+              <w:rPr>
+                <w:sz w:val="20"/>
+              </w:rPr>
+              <w:t>2</w:t>
+            </w:r>
+          </w:p>
+        </w:tc>
+        <w:tc>
+          <w:tcPr>
+            <w:tcW w:type="dxa" w:w="1587"/>
+          </w:tcPr>
+          <w:p>
+            <w:pPr>
+              <w:spacing w:after="0" w:line="240" w:lineRule="auto"/>
+              <w:ind w:firstLine="0"/>
+            </w:pPr>
+            <w:r/>
+            <w:r>
+              <w:rPr>
+                <w:sz w:val="20"/>
+              </w:rPr>
+              <w:t>0,167</w:t>
+            </w:r>
+          </w:p>
+        </w:tc>
+        <w:tc>
+          <w:tcPr>
+            <w:tcW w:type="dxa" w:w="1814"/>
+          </w:tcPr>
+          <w:p>
+            <w:pPr>
+              <w:spacing w:after="0" w:line="240" w:lineRule="auto"/>
+              <w:ind w:firstLine="0"/>
+            </w:pPr>
+            <w:r/>
+            <w:r>
+              <w:rPr>
+                <w:sz w:val="20"/>
+              </w:rPr>
+              <w:t>так</w:t>
+            </w:r>
+          </w:p>
+        </w:tc>
+        <w:tc>
+          <w:tcPr>
+            <w:tcW w:type="dxa" w:w="1984"/>
+          </w:tcPr>
+          <w:p>
+            <w:pPr>
+              <w:spacing w:after="0" w:line="240" w:lineRule="auto"/>
+              <w:ind w:firstLine="0"/>
+            </w:pPr>
+            <w:r/>
+            <w:r>
+              <w:rPr>
+                <w:sz w:val="20"/>
+              </w:rPr>
+              <w:t>21,8 %</w:t>
+            </w:r>
+          </w:p>
+        </w:tc>
+      </w:tr>
+      <w:tr>
+        <w:tc>
+          <w:tcPr>
+            <w:tcW w:type="dxa" w:w="1417"/>
+          </w:tcPr>
+          <w:p>
+            <w:pPr>
+              <w:spacing w:after="0" w:line="240" w:lineRule="auto"/>
+              <w:ind w:firstLine="0"/>
+            </w:pPr>
+            <w:r/>
+            <w:r>
+              <w:rPr>
+                <w:sz w:val="20"/>
+              </w:rPr>
+              <w:t>…507388</w:t>
+            </w:r>
+          </w:p>
+        </w:tc>
+        <w:tc>
+          <w:tcPr>
+            <w:tcW w:type="dxa" w:w="1417"/>
+          </w:tcPr>
+          <w:p>
+            <w:pPr>
+              <w:spacing w:after="0" w:line="240" w:lineRule="auto"/>
+              <w:ind w:firstLine="0"/>
+            </w:pPr>
+            <w:r/>
+            <w:r>
+              <w:rPr>
+                <w:sz w:val="20"/>
+              </w:rPr>
+              <w:t>0,8095</w:t>
+            </w:r>
+          </w:p>
+        </w:tc>
+        <w:tc>
+          <w:tcPr>
+            <w:tcW w:type="dxa" w:w="1020"/>
+          </w:tcPr>
+          <w:p>
+            <w:pPr>
+              <w:spacing w:after="0" w:line="240" w:lineRule="auto"/>
+              <w:ind w:firstLine="0"/>
+            </w:pPr>
+            <w:r/>
+            <w:r>
+              <w:rPr>
+                <w:sz w:val="20"/>
+              </w:rPr>
+              <w:t>1</w:t>
+            </w:r>
+          </w:p>
+        </w:tc>
+        <w:tc>
+          <w:tcPr>
+            <w:tcW w:type="dxa" w:w="1587"/>
+          </w:tcPr>
+          <w:p>
+            <w:pPr>
+              <w:spacing w:after="0" w:line="240" w:lineRule="auto"/>
+              <w:ind w:firstLine="0"/>
+            </w:pPr>
+            <w:r/>
+            <w:r>
+              <w:rPr>
+                <w:sz w:val="20"/>
+              </w:rPr>
+              <w:t>0,164</w:t>
+            </w:r>
+          </w:p>
+        </w:tc>
+        <w:tc>
+          <w:tcPr>
+            <w:tcW w:type="dxa" w:w="1814"/>
+          </w:tcPr>
+          <w:p>
+            <w:pPr>
+              <w:spacing w:after="0" w:line="240" w:lineRule="auto"/>
+              <w:ind w:firstLine="0"/>
+            </w:pPr>
+            <w:r/>
+            <w:r>
+              <w:rPr>
+                <w:sz w:val="20"/>
+              </w:rPr>
+              <w:t>ні</w:t>
+            </w:r>
+          </w:p>
+        </w:tc>
+        <w:tc>
+          <w:tcPr>
+            <w:tcW w:type="dxa" w:w="1984"/>
+          </w:tcPr>
+          <w:p>
+            <w:pPr>
+              <w:spacing w:after="0" w:line="240" w:lineRule="auto"/>
+              <w:ind w:firstLine="0"/>
+            </w:pPr>
+            <w:r/>
+            <w:r>
+              <w:rPr>
+                <w:sz w:val="20"/>
+              </w:rPr>
+              <w:t>16,7 %</w:t>
+            </w:r>
+          </w:p>
+        </w:tc>
+      </w:tr>
+    </w:tbl>
+    <w:p>
+      <w:pPr>
+        <w:spacing w:after="0"/>
+      </w:pPr>
+    </w:p>
+    <w:p>
+      <w:pPr>
+        <w:spacing w:before="40" w:after="200" w:line="240" w:lineRule="auto"/>
+        <w:ind w:firstLine="0"/>
+      </w:pPr>
+      <w:r>
+        <w:rPr>
+          <w:i/>
+          <w:sz w:val="22"/>
+        </w:rPr>
+        <w:t>Таблиця 9.2 — Зіставлення карти активацій із розміткою</w:t>
+      </w:r>
+    </w:p>
+    <w:p>
+      <w:pPr>
+        <w:spacing w:after="120"/>
+        <w:ind w:firstLine="709"/>
+        <w:jc w:val="both"/>
+      </w:pPr>
+      <w:r>
+        <w:rPr>
+          <w:b w:val="0"/>
+          <w:i w:val="0"/>
+        </w:rPr>
+        <w:t>Невисокі значення IoU пояснюються насамперед різницею масштабів: бінаризована карта охоплює 17–22 % кадру, тоді як розмічені рамки значно менші. Ці числа описують співвідношення візуалізації з розміткою на кількох зображеннях і не є ані бенчмарком локалізації, ані показником діагностичної точності.</w:t>
+      </w:r>
+    </w:p>
+    <w:p>
+      <w:pPr>
+        <w:pStyle w:val="Heading2"/>
+      </w:pPr>
+      <w:r>
+        <w:t>9.5. Обмеження візуалізації</w:t>
+      </w:r>
+    </w:p>
+    <w:p>
+      <w:pPr>
+        <w:spacing w:after="120"/>
+        <w:ind w:firstLine="709"/>
+        <w:jc w:val="both"/>
+      </w:pPr>
+      <w:r>
+        <w:rPr>
+          <w:b/>
+          <w:i w:val="0"/>
+        </w:rPr>
+        <w:t>Карта активацій показує ділянки зображення, пов’язані з рішенням моделі. Вона не є доказом локалізації захворювання і не є діагностичним висновком.</w:t>
+      </w:r>
+    </w:p>
+    <w:p>
+      <w:pPr>
+        <w:pStyle w:val="ListBullet"/>
+      </w:pPr>
+      <w:r>
+        <w:t>карта обчислюється на сітці 7 × 7 і масштабується до 224 × 224, тож її фактична роздільність — близько 32 пікселів; окреслити межу вогнища вона не може;</w:t>
+      </w:r>
+    </w:p>
+    <w:p>
+      <w:pPr>
+        <w:pStyle w:val="ListBullet"/>
+      </w:pPr>
+      <w:r>
+        <w:t>мережу навчено лише на мітках рівня зображення — жодної рамки під час навчання вона не бачила, тому ніщо не змушувало її спиратися саме на розмічену ділянку;</w:t>
+      </w:r>
+    </w:p>
+    <w:p>
+      <w:pPr>
+        <w:pStyle w:val="ListBullet"/>
+      </w:pPr>
+      <w:r>
+        <w:t>карта відображає кореляцію з рішенням, а не причинність: правильна відповідь може бути отримана за контекстом (дроти обладнання, положення пацієнта, кадрування), а не за самою знахідкою;</w:t>
+      </w:r>
+    </w:p>
+    <w:p>
+      <w:pPr>
+        <w:pStyle w:val="ListBullet"/>
+      </w:pPr>
+      <w:r>
+        <w:t>нормування на власний максимум робить яскравість відносною в межах одного знімка, тому карти різних зображень не можна порівнювати між собою за інтенсивністю.</w:t>
+      </w:r>
+    </w:p>
+    <w:p>
+      <w:pPr>
+        <w:pStyle w:val="Heading2"/>
+      </w:pPr>
+      <w:r>
+        <w:t>9.6. Автоматичні перевірки</w:t>
+      </w:r>
+    </w:p>
+    <w:p>
+      <w:pPr>
+        <w:spacing w:after="120"/>
+        <w:ind w:firstLine="709"/>
+        <w:jc w:val="both"/>
+      </w:pPr>
+      <w:r>
+        <w:rPr>
+          <w:b w:val="0"/>
+          <w:i w:val="0"/>
+        </w:rPr>
+        <w:t>Реалізовано дванадцять перевірок: шість для конвеєра висновування (ai/src/inference/test_inference.py) і шість для візуалізації (ai/src/analysis/test_cam.py). Перевіряються завантаження контрольної точки в режимі оцінювання, побітовий збіг попереднього оброблення з Dataset, форма та тип вихідного тензора, належність імовірності проміжку [0; 1], відтворюваність збережених тестових прогнозів із точністю 10⁻⁴, детермінованість повторних викликів, коректність розміру та діапазону карти активацій, відсутність нечислових значень, збіг перерахованої ймовірності з прямим проходом мережі, а також запис усіх зображень і файлу result.json. Поточний стан — 12 з 12.</w:t>
+      </w:r>
+    </w:p>
+    <w:p>
+      <w:pPr>
+        <w:pStyle w:val="Heading1"/>
+      </w:pPr>
+      <w:r>
+        <w:t>10. Експорт моделі для мобільного застосунку</w:t>
+      </w:r>
+    </w:p>
+    <w:p>
+      <w:pPr>
+        <w:spacing w:after="120"/>
+        <w:ind w:firstLine="709"/>
+        <w:jc w:val="both"/>
+      </w:pPr>
+      <w:r>
+        <w:rPr>
+          <w:b w:val="0"/>
+          <w:i w:val="0"/>
+        </w:rPr>
+        <w:t>Для роботи мережі безпосередньо на пристрої, без сервера, навчену контрольну точку експортовано у формат ONNX. Вибір середовища виконання — ONNX Runtime (пакет flutter_onnxruntime для Flutter), формат — ONNX fp32, opset 17, без квантування.</w:t>
+      </w:r>
+    </w:p>
+    <w:p>
+      <w:pPr>
+        <w:pStyle w:val="Heading2"/>
+      </w:pPr>
+      <w:r>
+        <w:t>10.1. Обґрунтування вибору формату</w:t>
+      </w:r>
+    </w:p>
+    <w:p>
+      <w:pPr>
+        <w:pStyle w:val="ListBullet"/>
+      </w:pPr>
+      <w:r>
+        <w:t>експорт виконується одним кроком безпосередньо з контрольної точки PyTorch; альтернативний шлях до формату TFLite потребував би ланцюжка PyTorch → ONNX → TensorFlow → TFLite з перекладанням розкладки NCHW → NHWC, де помилка виявляється не збоєм, а тихо зміненими числами;</w:t>
+      </w:r>
+    </w:p>
+    <w:p>
+      <w:pPr>
+        <w:pStyle w:val="ListBullet"/>
+      </w:pPr>
+      <w:r>
+        <w:t>усі операції мережі PulmoNet-7M є стандартними операторами ONNX: Conv, Relu, MaxPool, GlobalAveragePool, Gemm; пакетна нормалізація згортається у згортки під час константного згортання, а Dropout у режимі оцінювання зникає з графа;</w:t>
+      </w:r>
+    </w:p>
+    <w:p>
+      <w:pPr>
+        <w:pStyle w:val="ListBullet"/>
+      </w:pPr>
+      <w:r>
+        <w:t>розкладка NCHW зберігається без змін, як під час навчання;</w:t>
+      </w:r>
+    </w:p>
+    <w:p>
+      <w:pPr>
+        <w:pStyle w:val="ListBullet"/>
+      </w:pPr>
+      <w:r>
+        <w:t>той самий файл згодом придатний і для iOS — змінюється лише постачальник виконання.</w:t>
+      </w:r>
+    </w:p>
+    <w:p>
+      <w:pPr>
+        <w:spacing w:after="120"/>
+        <w:ind w:firstLine="709"/>
+        <w:jc w:val="both"/>
+      </w:pPr>
+      <w:r>
+        <w:rPr>
+          <w:b w:val="0"/>
+          <w:i w:val="0"/>
+        </w:rPr>
+        <w:t>Розмір вхідного тензора зафіксовано як [1, 1, 224, 224]: статична форма краще оптимізується мобільними середовищами виконання. Квантування до int8 наразі не застосовується — 28,26 МБ прийнятні для застосунку, а зменшення розрядності потребувало б окремої перевірки точності.</w:t>
+      </w:r>
+    </w:p>
+    <w:p>
+      <w:pPr>
+        <w:pStyle w:val="Heading2"/>
+      </w:pPr>
+      <w:r>
+        <w:t>10.2. Що саме експортовано</w:t>
+      </w:r>
+    </w:p>
+    <w:p>
+      <w:pPr>
+        <w:spacing w:after="120"/>
+        <w:ind w:firstLine="709"/>
+        <w:jc w:val="both"/>
+      </w:pPr>
+      <w:r>
+        <w:rPr>
+          <w:b w:val="0"/>
+          <w:i w:val="0"/>
+        </w:rPr>
+        <w:t>Експортовано лише мережу; попереднє оброблення залишено поза графом. Модель очікує рівно той тензор, який формує клас Dataset під час навчання: півтонове зображення, масштабоване до 224 × 224 білінійною інтерполяцією зі згладжуванням, приведене до діапазону [0; 1] та нормалізоване зі значеннями 0,4932 і 0,2458. Виходом є один необроблений логіт; сигмоїда та поріг 0,50 застосовуються на боці застосунку, як і під час навчання.</w:t>
+      </w:r>
+    </w:p>
+    <w:tbl>
+      <w:tblPr>
+        <w:tblStyle w:val="TableGrid"/>
+        <w:tblW w:type="auto" w:w="0"/>
+        <w:jc w:val="center"/>
+        <w:tblLook w:firstColumn="1" w:firstRow="1" w:lastColumn="0" w:lastRow="0" w:noHBand="0" w:noVBand="1" w:val="04A0"/>
+      </w:tblPr>
+      <w:tblGrid>
+        <w:gridCol w:w="4844"/>
+        <w:gridCol w:w="4844"/>
+      </w:tblGrid>
+      <w:tr>
+        <w:tc>
+          <w:tcPr>
+            <w:tcW w:type="dxa" w:w="2551"/>
+            <w:shd w:val="clear" w:color="auto" w:fill="DCE6F1"/>
+          </w:tcPr>
+          <w:p>
+            <w:pPr>
+              <w:spacing w:after="0" w:line="240" w:lineRule="auto"/>
+              <w:ind w:firstLine="0"/>
+            </w:pPr>
+            <w:r/>
+            <w:r>
+              <w:rPr>
+                <w:b/>
+                <w:sz w:val="22"/>
+              </w:rPr>
+              <w:t>Характеристика</w:t>
+            </w:r>
+          </w:p>
+        </w:tc>
+        <w:tc>
+          <w:tcPr>
+            <w:tcW w:type="dxa" w:w="6236"/>
+            <w:shd w:val="clear" w:color="auto" w:fill="DCE6F1"/>
+          </w:tcPr>
+          <w:p>
+            <w:pPr>
+              <w:spacing w:after="0" w:line="240" w:lineRule="auto"/>
+              <w:ind w:firstLine="0"/>
+            </w:pPr>
+            <w:r/>
+            <w:r>
+              <w:rPr>
+                <w:b/>
+                <w:sz w:val="22"/>
+              </w:rPr>
+              <w:t>Значення</w:t>
+            </w:r>
+          </w:p>
+        </w:tc>
+      </w:tr>
+      <w:tr>
+        <w:tc>
+          <w:tcPr>
+            <w:tcW w:type="dxa" w:w="2551"/>
+          </w:tcPr>
+          <w:p>
+            <w:pPr>
+              <w:spacing w:after="0" w:line="240" w:lineRule="auto"/>
+              <w:ind w:firstLine="0"/>
+            </w:pPr>
+            <w:r/>
+            <w:r>
+              <w:rPr>
+                <w:sz w:val="22"/>
+              </w:rPr>
+              <w:t>Файл</w:t>
+            </w:r>
+          </w:p>
+        </w:tc>
+        <w:tc>
+          <w:tcPr>
+            <w:tcW w:type="dxa" w:w="6236"/>
+          </w:tcPr>
+          <w:p>
+            <w:pPr>
+              <w:spacing w:after="0" w:line="240" w:lineRule="auto"/>
+              <w:ind w:firstLine="0"/>
+            </w:pPr>
+            <w:r/>
+            <w:r>
+              <w:rPr>
+                <w:sz w:val="22"/>
+              </w:rPr>
+              <w:t>pulmonet7m.onnx</w:t>
+            </w:r>
+          </w:p>
+        </w:tc>
+      </w:tr>
+      <w:tr>
+        <w:tc>
+          <w:tcPr>
+            <w:tcW w:type="dxa" w:w="2551"/>
+          </w:tcPr>
+          <w:p>
+            <w:pPr>
+              <w:spacing w:after="0" w:line="240" w:lineRule="auto"/>
+              <w:ind w:firstLine="0"/>
+            </w:pPr>
+            <w:r/>
+            <w:r>
+              <w:rPr>
+                <w:sz w:val="22"/>
+              </w:rPr>
+              <w:t>Розмір</w:t>
+            </w:r>
+          </w:p>
+        </w:tc>
+        <w:tc>
+          <w:tcPr>
+            <w:tcW w:type="dxa" w:w="6236"/>
+          </w:tcPr>
+          <w:p>
+            <w:pPr>
+              <w:spacing w:after="0" w:line="240" w:lineRule="auto"/>
+              <w:ind w:firstLine="0"/>
+            </w:pPr>
+            <w:r/>
+            <w:r>
+              <w:rPr>
+                <w:sz w:val="22"/>
+              </w:rPr>
+              <w:t>28,26 МБ</w:t>
+            </w:r>
+          </w:p>
+        </w:tc>
+      </w:tr>
+      <w:tr>
+        <w:tc>
+          <w:tcPr>
+            <w:tcW w:type="dxa" w:w="2551"/>
+          </w:tcPr>
+          <w:p>
+            <w:pPr>
+              <w:spacing w:after="0" w:line="240" w:lineRule="auto"/>
+              <w:ind w:firstLine="0"/>
+            </w:pPr>
+            <w:r/>
+            <w:r>
+              <w:rPr>
+                <w:sz w:val="22"/>
+              </w:rPr>
+              <w:t>Формат</w:t>
+            </w:r>
+          </w:p>
+        </w:tc>
+        <w:tc>
+          <w:tcPr>
+            <w:tcW w:type="dxa" w:w="6236"/>
+          </w:tcPr>
+          <w:p>
+            <w:pPr>
+              <w:spacing w:after="0" w:line="240" w:lineRule="auto"/>
+              <w:ind w:firstLine="0"/>
+            </w:pPr>
+            <w:r/>
+            <w:r>
+              <w:rPr>
+                <w:sz w:val="22"/>
+              </w:rPr>
+              <w:t>ONNX fp32, opset 17, IR 8</w:t>
+            </w:r>
+          </w:p>
+        </w:tc>
+      </w:tr>
+      <w:tr>
+        <w:tc>
+          <w:tcPr>
+            <w:tcW w:type="dxa" w:w="2551"/>
+          </w:tcPr>
+          <w:p>
+            <w:pPr>
+              <w:spacing w:after="0" w:line="240" w:lineRule="auto"/>
+              <w:ind w:firstLine="0"/>
+            </w:pPr>
+            <w:r/>
+            <w:r>
+              <w:rPr>
+                <w:sz w:val="22"/>
+              </w:rPr>
+              <w:t>Вхід</w:t>
+            </w:r>
+          </w:p>
+        </w:tc>
+        <w:tc>
+          <w:tcPr>
+            <w:tcW w:type="dxa" w:w="6236"/>
+          </w:tcPr>
+          <w:p>
+            <w:pPr>
+              <w:spacing w:after="0" w:line="240" w:lineRule="auto"/>
+              <w:ind w:firstLine="0"/>
+            </w:pPr>
+            <w:r/>
+            <w:r>
+              <w:rPr>
+                <w:sz w:val="22"/>
+              </w:rPr>
+              <w:t>input, [1, 1, 224, 224], float32, NCHW</w:t>
+            </w:r>
+          </w:p>
+        </w:tc>
+      </w:tr>
+      <w:tr>
+        <w:tc>
+          <w:tcPr>
+            <w:tcW w:type="dxa" w:w="2551"/>
+          </w:tcPr>
+          <w:p>
+            <w:pPr>
+              <w:spacing w:after="0" w:line="240" w:lineRule="auto"/>
+              <w:ind w:firstLine="0"/>
+            </w:pPr>
+            <w:r/>
+            <w:r>
+              <w:rPr>
+                <w:sz w:val="22"/>
+              </w:rPr>
+              <w:t>Вихід</w:t>
+            </w:r>
+          </w:p>
+        </w:tc>
+        <w:tc>
+          <w:tcPr>
+            <w:tcW w:type="dxa" w:w="6236"/>
+          </w:tcPr>
+          <w:p>
+            <w:pPr>
+              <w:spacing w:after="0" w:line="240" w:lineRule="auto"/>
+              <w:ind w:firstLine="0"/>
+            </w:pPr>
+            <w:r/>
+            <w:r>
+              <w:rPr>
+                <w:sz w:val="22"/>
+              </w:rPr>
+              <w:t>logit, [1, 1], float32</w:t>
+            </w:r>
+          </w:p>
+        </w:tc>
+      </w:tr>
+      <w:tr>
+        <w:tc>
+          <w:tcPr>
+            <w:tcW w:type="dxa" w:w="2551"/>
+          </w:tcPr>
+          <w:p>
+            <w:pPr>
+              <w:spacing w:after="0" w:line="240" w:lineRule="auto"/>
+              <w:ind w:firstLine="0"/>
+            </w:pPr>
+            <w:r/>
+            <w:r>
+              <w:rPr>
+                <w:sz w:val="22"/>
+              </w:rPr>
+              <w:t>Оператори графа</w:t>
+            </w:r>
+          </w:p>
+        </w:tc>
+        <w:tc>
+          <w:tcPr>
+            <w:tcW w:type="dxa" w:w="6236"/>
+          </w:tcPr>
+          <w:p>
+            <w:pPr>
+              <w:spacing w:after="0" w:line="240" w:lineRule="auto"/>
+              <w:ind w:firstLine="0"/>
+            </w:pPr>
+            <w:r/>
+            <w:r>
+              <w:rPr>
+                <w:sz w:val="22"/>
+              </w:rPr>
+              <w:t>Conv, Relu, MaxPool, GlobalAveragePool, Gemm, Flatten, Reshape, Squeeze, Constant</w:t>
+            </w:r>
+          </w:p>
+        </w:tc>
+      </w:tr>
+      <w:tr>
+        <w:tc>
+          <w:tcPr>
+            <w:tcW w:type="dxa" w:w="2551"/>
+          </w:tcPr>
+          <w:p>
+            <w:pPr>
+              <w:spacing w:after="0" w:line="240" w:lineRule="auto"/>
+              <w:ind w:firstLine="0"/>
+            </w:pPr>
+            <w:r/>
+            <w:r>
+              <w:rPr>
+                <w:sz w:val="22"/>
+              </w:rPr>
+              <w:t>Ваги у графі</w:t>
+            </w:r>
+          </w:p>
+        </w:tc>
+        <w:tc>
+          <w:tcPr>
+            <w:tcW w:type="dxa" w:w="6236"/>
+          </w:tcPr>
+          <w:p>
+            <w:pPr>
+              <w:spacing w:after="0" w:line="240" w:lineRule="auto"/>
+              <w:ind w:firstLine="0"/>
+            </w:pPr>
+            <w:r/>
+            <w:r>
+              <w:rPr>
+                <w:sz w:val="22"/>
+              </w:rPr>
+              <w:t>7 063 105 елементів (проти 7 065 953 параметрів PyTorch: пакетну нормалізацію згорнуто)</w:t>
+            </w:r>
+          </w:p>
+        </w:tc>
+      </w:tr>
+    </w:tbl>
+    <w:p>
+      <w:pPr>
+        <w:spacing w:after="0"/>
+      </w:pPr>
+    </w:p>
+    <w:p>
+      <w:pPr>
+        <w:spacing w:before="40" w:after="200" w:line="240" w:lineRule="auto"/>
+        <w:ind w:firstLine="0"/>
+      </w:pPr>
+      <w:r>
+        <w:rPr>
+          <w:i/>
+          <w:sz w:val="22"/>
+        </w:rPr>
+        <w:t>Таблиця 10.1 — Характеристики експортованої моделі</w:t>
+      </w:r>
+    </w:p>
+    <w:p>
+      <w:pPr>
+        <w:pStyle w:val="Heading2"/>
+      </w:pPr>
+      <w:r>
+        <w:t>10.3. Перевірка еквівалентності</w:t>
+      </w:r>
+    </w:p>
+    <w:p>
+      <w:pPr>
+        <w:spacing w:after="120"/>
+        <w:ind w:firstLine="709"/>
+        <w:jc w:val="both"/>
+      </w:pPr>
+      <w:r>
+        <w:rPr>
+          <w:b w:val="0"/>
+          <w:i w:val="0"/>
+        </w:rPr>
+        <w:t>Сценарій verify_onnx.py виконує два порівняння, оскільки вони вимірюють різні речі. Перше — власне точність експорту: вихід ONNX порівнюється з виходом контрольної точки PyTorch **на тому самому пристрої** (центральному процесорі) за однакового вхідного тензора; саме це є критерієм приймання з допуском 10⁻⁴. Друге — наскрізна перевірка проти ймовірностей, збережених під час єдиного оцінювання у файлі predictions_test.csv.</w:t>
+      </w:r>
+    </w:p>
+    <w:tbl>
+      <w:tblPr>
+        <w:tblStyle w:val="TableGrid"/>
+        <w:tblW w:type="auto" w:w="0"/>
+        <w:jc w:val="center"/>
+        <w:tblLook w:firstColumn="1" w:firstRow="1" w:lastColumn="0" w:lastRow="0" w:noHBand="0" w:noVBand="1" w:val="04A0"/>
+      </w:tblPr>
+      <w:tblGrid>
+        <w:gridCol w:w="2422"/>
+        <w:gridCol w:w="2422"/>
+        <w:gridCol w:w="2422"/>
+        <w:gridCol w:w="2422"/>
+      </w:tblGrid>
+      <w:tr>
+        <w:tc>
+          <w:tcPr>
+            <w:tcW w:type="dxa" w:w="3969"/>
+            <w:shd w:val="clear" w:color="auto" w:fill="DCE6F1"/>
+          </w:tcPr>
+          <w:p>
+            <w:pPr>
+              <w:spacing w:after="0" w:line="240" w:lineRule="auto"/>
+              <w:ind w:firstLine="0"/>
+            </w:pPr>
+            <w:r/>
+            <w:r>
+              <w:rPr>
+                <w:b/>
+                <w:sz w:val="20"/>
+              </w:rPr>
+              <w:t>Порівняння</w:t>
+            </w:r>
+          </w:p>
+        </w:tc>
+        <w:tc>
+          <w:tcPr>
+            <w:tcW w:type="dxa" w:w="1701"/>
+            <w:shd w:val="clear" w:color="auto" w:fill="DCE6F1"/>
+          </w:tcPr>
+          <w:p>
+            <w:pPr>
+              <w:spacing w:after="0" w:line="240" w:lineRule="auto"/>
+              <w:ind w:firstLine="0"/>
+            </w:pPr>
+            <w:r/>
+            <w:r>
+              <w:rPr>
+                <w:b/>
+                <w:sz w:val="20"/>
+              </w:rPr>
+              <w:t>Максимум |Δp|</w:t>
+            </w:r>
+          </w:p>
+        </w:tc>
+        <w:tc>
+          <w:tcPr>
+            <w:tcW w:type="dxa" w:w="1587"/>
+            <w:shd w:val="clear" w:color="auto" w:fill="DCE6F1"/>
+          </w:tcPr>
+          <w:p>
+            <w:pPr>
+              <w:spacing w:after="0" w:line="240" w:lineRule="auto"/>
+              <w:ind w:firstLine="0"/>
+            </w:pPr>
+            <w:r/>
+            <w:r>
+              <w:rPr>
+                <w:b/>
+                <w:sz w:val="20"/>
+              </w:rPr>
+              <w:t>Середнє |Δp|</w:t>
+            </w:r>
+          </w:p>
+        </w:tc>
+        <w:tc>
+          <w:tcPr>
+            <w:tcW w:type="dxa" w:w="1531"/>
+            <w:shd w:val="clear" w:color="auto" w:fill="DCE6F1"/>
+          </w:tcPr>
+          <w:p>
+            <w:pPr>
+              <w:spacing w:after="0" w:line="240" w:lineRule="auto"/>
+              <w:ind w:firstLine="0"/>
+            </w:pPr>
+            <w:r/>
+            <w:r>
+              <w:rPr>
+                <w:b/>
+                <w:sz w:val="20"/>
+              </w:rPr>
+              <w:t>Випадків понад межу</w:t>
+            </w:r>
+          </w:p>
+        </w:tc>
+      </w:tr>
+      <w:tr>
+        <w:tc>
+          <w:tcPr>
+            <w:tcW w:type="dxa" w:w="3969"/>
+          </w:tcPr>
+          <w:p>
+            <w:pPr>
+              <w:spacing w:after="0" w:line="240" w:lineRule="auto"/>
+              <w:ind w:firstLine="0"/>
+            </w:pPr>
+            <w:r/>
+            <w:r>
+              <w:rPr>
+                <w:sz w:val="20"/>
+              </w:rPr>
+              <w:t>ONNX (ЦП) проти PyTorch (ЦП) — критерій</w:t>
+            </w:r>
+          </w:p>
+        </w:tc>
+        <w:tc>
+          <w:tcPr>
+            <w:tcW w:type="dxa" w:w="1701"/>
+          </w:tcPr>
+          <w:p>
+            <w:pPr>
+              <w:spacing w:after="0" w:line="240" w:lineRule="auto"/>
+              <w:ind w:firstLine="0"/>
+            </w:pPr>
+            <w:r/>
+            <w:r>
+              <w:rPr>
+                <w:sz w:val="20"/>
+              </w:rPr>
+              <w:t>1,788·10⁻⁷</w:t>
+            </w:r>
+          </w:p>
+        </w:tc>
+        <w:tc>
+          <w:tcPr>
+            <w:tcW w:type="dxa" w:w="1587"/>
+          </w:tcPr>
+          <w:p>
+            <w:pPr>
+              <w:spacing w:after="0" w:line="240" w:lineRule="auto"/>
+              <w:ind w:firstLine="0"/>
+            </w:pPr>
+            <w:r/>
+            <w:r>
+              <w:rPr>
+                <w:sz w:val="20"/>
+              </w:rPr>
+              <w:t>2,772·10⁻⁸</w:t>
+            </w:r>
+          </w:p>
+        </w:tc>
+        <w:tc>
+          <w:tcPr>
+            <w:tcW w:type="dxa" w:w="1531"/>
+          </w:tcPr>
+          <w:p>
+            <w:pPr>
+              <w:spacing w:after="0" w:line="240" w:lineRule="auto"/>
+              <w:ind w:firstLine="0"/>
+            </w:pPr>
+            <w:r/>
+            <w:r>
+              <w:rPr>
+                <w:sz w:val="20"/>
+              </w:rPr>
+              <w:t>0 зі 100</w:t>
+            </w:r>
+          </w:p>
+        </w:tc>
+      </w:tr>
+      <w:tr>
+        <w:tc>
+          <w:tcPr>
+            <w:tcW w:type="dxa" w:w="3969"/>
+          </w:tcPr>
+          <w:p>
+            <w:pPr>
+              <w:spacing w:after="0" w:line="240" w:lineRule="auto"/>
+              <w:ind w:firstLine="0"/>
+            </w:pPr>
+            <w:r/>
+            <w:r>
+              <w:rPr>
+                <w:sz w:val="20"/>
+              </w:rPr>
+              <w:t>ONNX (ЦП) проти збережених прогнозів (ГП)</w:t>
+            </w:r>
+          </w:p>
+        </w:tc>
+        <w:tc>
+          <w:tcPr>
+            <w:tcW w:type="dxa" w:w="1701"/>
+          </w:tcPr>
+          <w:p>
+            <w:pPr>
+              <w:spacing w:after="0" w:line="240" w:lineRule="auto"/>
+              <w:ind w:firstLine="0"/>
+            </w:pPr>
+            <w:r/>
+            <w:r>
+              <w:rPr>
+                <w:sz w:val="20"/>
+              </w:rPr>
+              <w:t>1,231·10⁻⁴</w:t>
+            </w:r>
+          </w:p>
+        </w:tc>
+        <w:tc>
+          <w:tcPr>
+            <w:tcW w:type="dxa" w:w="1587"/>
+          </w:tcPr>
+          <w:p>
+            <w:pPr>
+              <w:spacing w:after="0" w:line="240" w:lineRule="auto"/>
+              <w:ind w:firstLine="0"/>
+            </w:pPr>
+            <w:r/>
+            <w:r>
+              <w:rPr>
+                <w:sz w:val="20"/>
+              </w:rPr>
+              <w:t>1,598·10⁻⁵</w:t>
+            </w:r>
+          </w:p>
+        </w:tc>
+        <w:tc>
+          <w:tcPr>
+            <w:tcW w:type="dxa" w:w="1531"/>
+          </w:tcPr>
+          <w:p>
+            <w:pPr>
+              <w:spacing w:after="0" w:line="240" w:lineRule="auto"/>
+              <w:ind w:firstLine="0"/>
+            </w:pPr>
+            <w:r/>
+            <w:r>
+              <w:rPr>
+                <w:sz w:val="20"/>
+              </w:rPr>
+              <w:t>0 зі 100</w:t>
+            </w:r>
+          </w:p>
+        </w:tc>
+      </w:tr>
+    </w:tbl>
+    <w:p>
+      <w:pPr>
+        <w:spacing w:after="0"/>
+      </w:pPr>
+    </w:p>
+    <w:p>
+      <w:pPr>
+        <w:spacing w:before="40" w:after="200" w:line="240" w:lineRule="auto"/>
+        <w:ind w:firstLine="0"/>
+      </w:pPr>
+      <w:r>
+        <w:rPr>
+          <w:i/>
+          <w:sz w:val="22"/>
+        </w:rPr>
+        <w:t>Таблиця 10.2 — Результати перевірки на 100 випадкових зображеннях тестової вибірки (початкове значення генератора 42)</w:t>
+      </w:r>
+    </w:p>
+    <w:p>
+      <w:pPr>
+        <w:spacing w:after="120"/>
+        <w:ind w:firstLine="709"/>
+        <w:jc w:val="both"/>
+      </w:pPr>
+      <w:r>
+        <w:rPr>
+          <w:b w:val="0"/>
+          <w:i w:val="0"/>
+        </w:rPr>
+        <w:t>Другий рядок потребує пояснення. Збережені прогнози обчислено на графічному процесорі, де PyTorch за замовчуванням використовує для згорток арифметику TF32 (параметр cudnn.allow_tf32 має значення True). Контрольний вимір на тих самих зображеннях: розбіжність між ONNX і PyTorch на центральному процесорі — 1,788·10⁻⁷; між PyTorch на центральному процесорі та збереженими значеннями — 1,231·10⁻⁴; між **повторним запуском** PyTorch на графічному процесорі та збереженими значеннями — 1,382·10⁻⁴. Останнє й показує суть: та сама модель на тому самому пристрої не відтворює збережені значення побітово. Залишкова розбіжність порядку 10⁻⁴ є властивістю обчислень із рухомою комою на графічному процесорі, присутня незалежно від ONNX, і на три порядки менша за поріг ухвалення рішення 0,50 — жоден тестовий прогноз через неї не змінює клас.</w:t>
+      </w:r>
+    </w:p>
+    <w:p>
+      <w:pPr>
+        <w:spacing w:after="120"/>
+        <w:ind w:firstLine="709"/>
+        <w:jc w:val="both"/>
+      </w:pPr>
+      <w:r>
+        <w:rPr>
+          <w:b w:val="0"/>
+          <w:i w:val="0"/>
+        </w:rPr>
+        <w:t>Додатково перевірено коректність графа засобом onnx.checker, а також імена та форми входу і виходу, версію opset і запуск через постачальника CPUExecutionProvider — усі дев’ять перевірок пройдено. Час одного висновування на центральному процесорі робочої станції: у середньому 11,4 мс, медіана 11,3 мс, 95-й процентиль 12,0 мс; на мобільному пристрої слід очікувати більших значень.</w:t>
+      </w:r>
+    </w:p>
+    <w:p>
+      <w:pPr>
+        <w:spacing w:after="120"/>
+        <w:ind w:firstLine="709"/>
+        <w:jc w:val="both"/>
+      </w:pPr>
+      <w:r>
+        <w:rPr>
+          <w:b w:val="0"/>
+          <w:i w:val="0"/>
+        </w:rPr>
+        <w:t>Артефакти експорту збережено в каталозі ai/experiments/pulmonet7m-scratch/export/: сама модель pulmonet7m.onnx, файл export_graph.json з характеристиками графа та export_summary.json, який містить повний контракт входу й виходу (імена, форми, константи нормалізації, поріг) і статистику перевірки. Саме цей файл використовуватиметься як джерело істини під час інтеграції з мобільним застосунком.</w:t>
+      </w:r>
+    </w:p>
+    <w:p>
+      <w:pPr>
+        <w:pStyle w:val="Heading1"/>
+      </w:pPr>
+      <w:r>
+        <w:t>11. Мобільний застосунок</w:t>
       </w:r>
     </w:p>
     <w:p>
@@ -8748,7 +11134,7 @@
           <w:i/>
           <w:sz w:val="22"/>
         </w:rPr>
-        <w:t>Таблиця 9.1 — Екрани застосунку</w:t>
+        <w:t>Таблиця 11.1 — Екрани застосунку</w:t>
       </w:r>
     </w:p>
     <w:p>
@@ -8770,7 +11156,7 @@
         <w:pStyle w:val="Heading1"/>
       </w:pPr>
       <w:r>
-        <w:t>10. Програмні засоби та структура проєкту</w:t>
+        <w:t>12. Програмні засоби та структура проєкту</w:t>
       </w:r>
     </w:p>
     <w:tbl>
@@ -9070,7 +11456,7 @@
           <w:i/>
           <w:sz w:val="22"/>
         </w:rPr>
-        <w:t>Таблиця 10.1 — Програмні та апаратні засоби</w:t>
+        <w:t>Таблиця 12.1 — Програмні та апаратні засоби</w:t>
       </w:r>
     </w:p>
     <w:p>
@@ -9103,6 +11489,14 @@
         <w:br/>
         <w:t>├── src/analysis/plot_experiment.py  графіки та аналіз експерименту</w:t>
         <w:br/>
+        <w:t>├── src/analysis/cam.py          карти активацій (CAM)</w:t>
+        <w:br/>
+        <w:t>├── src/inference/predict.py     висновування для одного знімка</w:t>
+        <w:br/>
+        <w:t>├── src/export/export_onnx.py    експорт у формат ONNX</w:t>
+        <w:br/>
+        <w:t>├── src/export/verify_onnx.py    перевірка еквівалентності</w:t>
+        <w:br/>
         <w:t>├── src/training/</w:t>
         <w:br/>
         <w:t>│   ├── losses.py, metrics.py    функція втрат і метрики</w:t>
@@ -9117,7 +11511,13 @@
         <w:br/>
         <w:t>└── experiments/                 результати запусків навчання</w:t>
         <w:br/>
-        <w:t xml:space="preserve">    └── pulmonet7m-scratch/plots/  графіки, аналізи, зведення</w:t>
+        <w:t xml:space="preserve">    └── pulmonet7m-scratch/</w:t>
+        <w:br/>
+        <w:t xml:space="preserve">        ├── plots/               графіки, аналізи, зведення</w:t>
+        <w:br/>
+        <w:t xml:space="preserve">        ├── cam/                 карти активацій за знімками</w:t>
+        <w:br/>
+        <w:t xml:space="preserve">        └── export/              модель ONNX і звіт перевірки</w:t>
         <w:br/>
         <w:br/>
         <w:t>lib/                             мобільний застосунок Flutter</w:t>
@@ -9141,7 +11541,7 @@
           <w:i/>
           <w:sz w:val="22"/>
         </w:rPr>
-        <w:t>Рисунок 10.1 — Структура репозиторію</w:t>
+        <w:t>Рисунок 12.1 — Структура репозиторію</w:t>
       </w:r>
     </w:p>
     <w:p>
@@ -9163,7 +11563,7 @@
         <w:pStyle w:val="Heading1"/>
       </w:pPr>
       <w:r>
-        <w:t>11. Виявлені проблеми та прийняті рішення</w:t>
+        <w:t>13. Виявлені проблеми та прийняті рішення</w:t>
       </w:r>
     </w:p>
     <w:tbl>
@@ -9637,6 +12037,82 @@
           </w:p>
         </w:tc>
       </w:tr>
+      <w:tr>
+        <w:tc>
+          <w:tcPr>
+            <w:tcW w:type="dxa" w:w="3969"/>
+          </w:tcPr>
+          <w:p>
+            <w:pPr>
+              <w:spacing w:after="0" w:line="240" w:lineRule="auto"/>
+              <w:ind w:firstLine="0"/>
+            </w:pPr>
+            <w:r/>
+            <w:r>
+              <w:rPr>
+                <w:sz w:val="20"/>
+              </w:rPr>
+              <w:t>Ризик розбіжності попереднього оброблення між навчанням і висновуванням</w:t>
+            </w:r>
+          </w:p>
+        </w:tc>
+        <w:tc>
+          <w:tcPr>
+            <w:tcW w:type="dxa" w:w="4819"/>
+          </w:tcPr>
+          <w:p>
+            <w:pPr>
+              <w:spacing w:after="0" w:line="240" w:lineRule="auto"/>
+              <w:ind w:firstLine="0"/>
+            </w:pPr>
+            <w:r/>
+            <w:r>
+              <w:rPr>
+                <w:sz w:val="20"/>
+              </w:rPr>
+              <w:t>конвеєр висновування викликає ті самі функції, що й Dataset; автоматична перевірка вимагає побітового збігу тензорів</w:t>
+            </w:r>
+          </w:p>
+        </w:tc>
+      </w:tr>
+      <w:tr>
+        <w:tc>
+          <w:tcPr>
+            <w:tcW w:type="dxa" w:w="3969"/>
+          </w:tcPr>
+          <w:p>
+            <w:pPr>
+              <w:spacing w:after="0" w:line="240" w:lineRule="auto"/>
+              <w:ind w:firstLine="0"/>
+            </w:pPr>
+            <w:r/>
+            <w:r>
+              <w:rPr>
+                <w:sz w:val="20"/>
+              </w:rPr>
+              <w:t>Збережені тестові прогнози не відтворюються побітово</w:t>
+            </w:r>
+          </w:p>
+        </w:tc>
+        <w:tc>
+          <w:tcPr>
+            <w:tcW w:type="dxa" w:w="4819"/>
+          </w:tcPr>
+          <w:p>
+            <w:pPr>
+              <w:spacing w:after="0" w:line="240" w:lineRule="auto"/>
+              <w:ind w:firstLine="0"/>
+            </w:pPr>
+            <w:r/>
+            <w:r>
+              <w:rPr>
+                <w:sz w:val="20"/>
+              </w:rPr>
+              <w:t>їх обчислено на графічному процесорі з арифметикою TF32; критерій перевірки експорту порівнює ONNX із PyTorch на тому самому пристрої, а розбіжність 10⁻⁴ задокументовано як властивість обчислень, а не дефект</w:t>
+            </w:r>
+          </w:p>
+        </w:tc>
+      </w:tr>
     </w:tbl>
     <w:p>
       <w:pPr>
@@ -9653,7 +12129,7 @@
           <w:i/>
           <w:sz w:val="22"/>
         </w:rPr>
-        <w:t>Таблиця 11.1 — Проблеми, виявлені під час виконання роботи</w:t>
+        <w:t>Таблиця 13.1 — Проблеми, виявлені під час виконання роботи</w:t>
       </w:r>
     </w:p>
     <w:p>
@@ -9661,7 +12137,7 @@
         <w:pStyle w:val="Heading1"/>
       </w:pPr>
       <w:r>
-        <w:t>12. Поточний стан і подальші кроки</w:t>
+        <w:t>14. Поточний стан і подальші кроки</w:t>
       </w:r>
     </w:p>
     <w:p>
@@ -9747,7 +12223,23 @@
         <w:pStyle w:val="ListBullet"/>
       </w:pPr>
       <w:r>
-        <w:t>графіки, аналіз динаміки навчання та аналіз помилок.</w:t>
+        <w:t>графіки, аналіз динаміки навчання та аналіз помилок;</w:t>
+      </w:r>
+    </w:p>
+    <w:p>
+      <w:pPr>
+        <w:pStyle w:val="ListBullet"/>
+      </w:pPr>
+      <w:r>
+        <w:t>конвеєр висновування для одного знімка та візуалізація активацій (CAM) з перевіркою на реальних знімках;</w:t>
+      </w:r>
+    </w:p>
+    <w:p>
+      <w:pPr>
+        <w:pStyle w:val="ListBullet"/>
+      </w:pPr>
+      <w:r>
+        <w:t>експорт моделі у формат ONNX із підтвердженою еквівалентністю (розбіжність 1,8·10⁻⁷).</w:t>
       </w:r>
     </w:p>
     <w:p>
@@ -9769,15 +12261,7 @@
         <w:pStyle w:val="ListBullet"/>
       </w:pPr>
       <w:r>
-        <w:t>візуалізація активацій (теплова карта) для пояснення результату;</w:t>
-      </w:r>
-    </w:p>
-    <w:p>
-      <w:pPr>
-        <w:pStyle w:val="ListBullet"/>
-      </w:pPr>
-      <w:r>
-        <w:t>експорт моделі у мобільний формат та інтеграція в застосунок замість імітаційної служби;</w:t>
+        <w:t>інтеграція експортованої моделі у мобільний застосунок замість імітаційної служби, включно з перенесенням попереднього оброблення та подальшою передачею карти активацій в інтерфейс;</w:t>
       </w:r>
     </w:p>
     <w:p>
@@ -9801,7 +12285,7 @@
         <w:pStyle w:val="Heading1"/>
       </w:pPr>
       <w:r>
-        <w:t>13. Джерела</w:t>
+        <w:t>15. Джерела</w:t>
       </w:r>
     </w:p>
     <w:p>

</xml_diff>

<commit_message>
integrate ai in flutter without CAM
</commit_message>
<xml_diff>
--- a/docs/PulmoAI_materialy_magisterska.docx
+++ b/docs/PulmoAI_materialy_magisterska.docx
@@ -10910,7 +10910,7 @@
           <w:b w:val="0"/>
           <w:i w:val="0"/>
         </w:rPr>
-        <w:t>Прикладну частину реалізовано на Flutter із дотриманням Material 3, адаптивною версткою та світлою і темною темами. На поточному етапі застосунок працює з імітаційною службою аналізу: інтерфейс і навігація повністю готові, а підключення навченої моделі не змінює жодного екрана.</w:t>
+        <w:t>Прикладну частину реалізовано на Flutter із дотриманням Material 3, адаптивною версткою та світлою і темною темами. Навчена мережа виконується **безпосередньо на пристрої**: файл моделі входить до складу застосунку, сервер не використовується, мережеве з’єднання не потрібне, зображення не залишає телефон.</w:t>
       </w:r>
     </w:p>
     <w:tbl>
@@ -11075,7 +11075,7 @@
               <w:rPr>
                 <w:sz w:val="22"/>
               </w:rPr>
-              <w:t>вердикт, рівень упевненості, пояснювальний блок, шар візуалізації (рамки та теплова карта)</w:t>
+              <w:t>назва та версія моделі, ймовірність, вердикт, час оброблення, пояснювальний блок</w:t>
             </w:r>
           </w:p>
         </w:tc>
@@ -11139,6 +11139,58 @@
     </w:p>
     <w:p>
       <w:pPr>
+        <w:pStyle w:val="Heading2"/>
+      </w:pPr>
+      <w:r>
+        <w:t>11.1. Архітектура висновування на пристрої</w:t>
+      </w:r>
+    </w:p>
+    <w:p>
+      <w:pPr>
+        <w:spacing w:before="80" w:after="160" w:line="240" w:lineRule="auto"/>
+        <w:ind w:firstLine="0" w:left="340"/>
+      </w:pPr>
+      <w:r>
+        <w:rPr>
+          <w:rFonts w:ascii="Consolas" w:hAnsi="Consolas" w:eastAsia="Consolas"/>
+          <w:sz w:val="18"/>
+        </w:rPr>
+        <w:t>image_picker (галерея / камера)</w:t>
+        <w:br/>
+        <w:t xml:space="preserve">   ↓  XRayImage {name, path}</w:t>
+        <w:br/>
+        <w:t>ImagePreprocessor            lib/services/image_preprocessor.dart</w:t>
+        <w:br/>
+        <w:t xml:space="preserve">   декодування PNG/JPEG → півтоновий канал → трикутний фільтр 224×224</w:t>
+        <w:br/>
+        <w:t xml:space="preserve">   → /255 → (x − 0,4932) / 0,2458 → Float32List [1, 1, 224, 224]</w:t>
+        <w:br/>
+        <w:t xml:space="preserve">   ↓  (виконується у фоновому ізоляті)</w:t>
+        <w:br/>
+        <w:t>OnnxAnalysisService          lib/services/onnx_analysis_service.dart</w:t>
+        <w:br/>
+        <w:t xml:space="preserve">   сесія flutter_onnxruntime, створюється один раз і повторно використовується</w:t>
+        <w:br/>
+        <w:t xml:space="preserve">   ↓  логіт → сигмоїда → ймовірність → поріг 0,50</w:t>
+        <w:br/>
+        <w:t>AnalysisResult → екран результату → сховище історії</w:t>
+      </w:r>
+    </w:p>
+    <w:p>
+      <w:pPr>
+        <w:spacing w:before="40" w:after="200" w:line="240" w:lineRule="auto"/>
+        <w:ind w:firstLine="0"/>
+      </w:pPr>
+      <w:r>
+        <w:rPr>
+          <w:i/>
+          <w:sz w:val="22"/>
+        </w:rPr>
+        <w:t>Рисунок 11.1 — Конвеєр висновування в застосунку</w:t>
+      </w:r>
+    </w:p>
+    <w:p>
+      <w:pPr>
         <w:spacing w:after="120"/>
         <w:ind w:firstLine="709"/>
         <w:jc w:val="both"/>
@@ -11148,7 +11200,2140 @@
           <w:b w:val="0"/>
           <w:i w:val="0"/>
         </w:rPr>
-        <w:t>Архітектура застосунку побудована так, щоб заміна імітаційної служби на реальну модель вимагала зміни одного рядка у точці збирання залежностей. Модель результату вже описує обмежувальні рамки в нормалізованих координатах — тому саме такому формату відповідає вихід конвеєра підготовки даних.</w:t>
+        <w:t>Модель зберігається як ресурс застосунку разом із картою моделі (model_card.json), звідки зчитуються імена входу й виходу, константи нормалізації, поріг ухвалення рішення та метрики. Жодне з цих значень не зашите в коді інтерфейсу. Сесія середовища виконання створюється один раз під час прогрівання і надалі використовується повторно; паралельні виклики очікують на той самий результат, тож друга сесія не виникає. Імітаційну службу залишено в проєкті — вона реалізує той самий контракт і використовується в тестах інтерфейсу.</w:t>
+      </w:r>
+    </w:p>
+    <w:p>
+      <w:pPr>
+        <w:pStyle w:val="Heading2"/>
+      </w:pPr>
+      <w:r>
+        <w:t>11.2. Відповідність попереднього оброблення</w:t>
+      </w:r>
+    </w:p>
+    <w:p>
+      <w:pPr>
+        <w:spacing w:after="120"/>
+        <w:ind w:firstLine="709"/>
+        <w:jc w:val="both"/>
+      </w:pPr>
+      <w:r>
+        <w:rPr>
+          <w:b w:val="0"/>
+          <w:i w:val="0"/>
+        </w:rPr>
+        <w:t>Найризикованіша частина інтеграції — повторити на пристрої той самий препроцесинг, що застосовувався під час навчання. Перевірка на шести контрольних знімках виявила три розбіжності, кожну з яких усунуто:</w:t>
+      </w:r>
+    </w:p>
+    <w:p>
+      <w:pPr>
+        <w:pStyle w:val="ListBullet"/>
+      </w:pPr>
+      <w:r>
+        <w:t>звернення до яскравості для одноканального зображення враховувало три канали, з яких два читалися як нуль, і повертало близько 30 % справжнього значення пікселя;</w:t>
+      </w:r>
+    </w:p>
+    <w:p>
+      <w:pPr>
+        <w:pStyle w:val="ListBullet"/>
+      </w:pPr>
+      <w:r>
+        <w:t>стандартне перетворення в півтони відкидає дробову частину зваженої суми та зміщує кожен піксель кольорового джерела до 1/255;</w:t>
+      </w:r>
+    </w:p>
+    <w:p>
+      <w:pPr>
+        <w:pStyle w:val="ListBullet"/>
+      </w:pPr>
+      <w:r>
+        <w:t>фільтр масштабування: під час навчання застосовано білінійну інтерполяцію зі згладжуванням, тобто трикутне ядро, ширина якого залежить від коефіцієнта зменшення. Доступний у бібліотеці усереднювальний (коробковий) фільтр відрізняється від нього до 0,17 діапазону пікселя і зміщує передбачену ймовірність до 2,1·10⁻².</w:t>
+      </w:r>
+    </w:p>
+    <w:p>
+      <w:pPr>
+        <w:spacing w:after="120"/>
+        <w:ind w:firstLine="709"/>
+        <w:jc w:val="both"/>
+      </w:pPr>
+      <w:r>
+        <w:rPr>
+          <w:b w:val="0"/>
+          <w:i w:val="0"/>
+        </w:rPr>
+        <w:t>Тому трикутний фільтр реалізовано безпосередньо в застосунку (роздільна згортка з попередньо обчисленими вагами). Після виправлення розбіжність із контрольним конвеєром на мові Python становить 5,17·10⁻⁵ на елемент тензора і **7,88·10⁻⁷ на передбаченій імовірності**.</w:t>
+      </w:r>
+    </w:p>
+    <w:tbl>
+      <w:tblPr>
+        <w:tblStyle w:val="TableGrid"/>
+        <w:tblW w:type="auto" w:w="0"/>
+        <w:jc w:val="center"/>
+        <w:tblLook w:firstColumn="1" w:firstRow="1" w:lastColumn="0" w:lastRow="0" w:noHBand="0" w:noVBand="1" w:val="04A0"/>
+      </w:tblPr>
+      <w:tblGrid>
+        <w:gridCol w:w="1938"/>
+        <w:gridCol w:w="1938"/>
+        <w:gridCol w:w="1938"/>
+        <w:gridCol w:w="1938"/>
+        <w:gridCol w:w="1938"/>
+      </w:tblGrid>
+      <w:tr>
+        <w:tc>
+          <w:tcPr>
+            <w:tcW w:type="dxa" w:w="1247"/>
+            <w:shd w:val="clear" w:color="auto" w:fill="DCE6F1"/>
+          </w:tcPr>
+          <w:p>
+            <w:pPr>
+              <w:spacing w:after="0" w:line="240" w:lineRule="auto"/>
+              <w:ind w:firstLine="0"/>
+            </w:pPr>
+            <w:r/>
+            <w:r>
+              <w:rPr>
+                <w:b/>
+                <w:sz w:val="20"/>
+              </w:rPr>
+              <w:t>Знімок</w:t>
+            </w:r>
+          </w:p>
+        </w:tc>
+        <w:tc>
+          <w:tcPr>
+            <w:tcW w:type="dxa" w:w="3118"/>
+            <w:shd w:val="clear" w:color="auto" w:fill="DCE6F1"/>
+          </w:tcPr>
+          <w:p>
+            <w:pPr>
+              <w:spacing w:after="0" w:line="240" w:lineRule="auto"/>
+              <w:ind w:firstLine="0"/>
+            </w:pPr>
+            <w:r/>
+            <w:r>
+              <w:rPr>
+                <w:b/>
+                <w:sz w:val="20"/>
+              </w:rPr>
+              <w:t>Клас</w:t>
+            </w:r>
+          </w:p>
+        </w:tc>
+        <w:tc>
+          <w:tcPr>
+            <w:tcW w:type="dxa" w:w="1361"/>
+            <w:shd w:val="clear" w:color="auto" w:fill="DCE6F1"/>
+          </w:tcPr>
+          <w:p>
+            <w:pPr>
+              <w:spacing w:after="0" w:line="240" w:lineRule="auto"/>
+              <w:ind w:firstLine="0"/>
+            </w:pPr>
+            <w:r/>
+            <w:r>
+              <w:rPr>
+                <w:b/>
+                <w:sz w:val="20"/>
+              </w:rPr>
+              <w:t>Python</w:t>
+            </w:r>
+          </w:p>
+        </w:tc>
+        <w:tc>
+          <w:tcPr>
+            <w:tcW w:type="dxa" w:w="1361"/>
+            <w:shd w:val="clear" w:color="auto" w:fill="DCE6F1"/>
+          </w:tcPr>
+          <w:p>
+            <w:pPr>
+              <w:spacing w:after="0" w:line="240" w:lineRule="auto"/>
+              <w:ind w:firstLine="0"/>
+            </w:pPr>
+            <w:r/>
+            <w:r>
+              <w:rPr>
+                <w:b/>
+                <w:sz w:val="20"/>
+              </w:rPr>
+              <w:t>Flutter</w:t>
+            </w:r>
+          </w:p>
+        </w:tc>
+        <w:tc>
+          <w:tcPr>
+            <w:tcW w:type="dxa" w:w="1417"/>
+            <w:shd w:val="clear" w:color="auto" w:fill="DCE6F1"/>
+          </w:tcPr>
+          <w:p>
+            <w:pPr>
+              <w:spacing w:after="0" w:line="240" w:lineRule="auto"/>
+              <w:ind w:firstLine="0"/>
+            </w:pPr>
+            <w:r/>
+            <w:r>
+              <w:rPr>
+                <w:b/>
+                <w:sz w:val="20"/>
+              </w:rPr>
+              <w:t>|Δp|</w:t>
+            </w:r>
+          </w:p>
+        </w:tc>
+      </w:tr>
+      <w:tr>
+        <w:tc>
+          <w:tcPr>
+            <w:tcW w:type="dxa" w:w="1247"/>
+          </w:tcPr>
+          <w:p>
+            <w:pPr>
+              <w:spacing w:after="0" w:line="240" w:lineRule="auto"/>
+              <w:ind w:firstLine="0"/>
+            </w:pPr>
+            <w:r/>
+            <w:r>
+              <w:rPr>
+                <w:sz w:val="20"/>
+              </w:rPr>
+              <w:t>509903</w:t>
+            </w:r>
+          </w:p>
+        </w:tc>
+        <w:tc>
+          <w:tcPr>
+            <w:tcW w:type="dxa" w:w="3118"/>
+          </w:tcPr>
+          <w:p>
+            <w:pPr>
+              <w:spacing w:after="0" w:line="240" w:lineRule="auto"/>
+              <w:ind w:firstLine="0"/>
+            </w:pPr>
+            <w:r/>
+            <w:r>
+              <w:rPr>
+                <w:sz w:val="20"/>
+              </w:rPr>
+              <w:t>Lung Opacity</w:t>
+            </w:r>
+          </w:p>
+        </w:tc>
+        <w:tc>
+          <w:tcPr>
+            <w:tcW w:type="dxa" w:w="1361"/>
+          </w:tcPr>
+          <w:p>
+            <w:pPr>
+              <w:spacing w:after="0" w:line="240" w:lineRule="auto"/>
+              <w:ind w:firstLine="0"/>
+            </w:pPr>
+            <w:r/>
+            <w:r>
+              <w:rPr>
+                <w:sz w:val="20"/>
+              </w:rPr>
+              <w:t>0,980178</w:t>
+            </w:r>
+          </w:p>
+        </w:tc>
+        <w:tc>
+          <w:tcPr>
+            <w:tcW w:type="dxa" w:w="1361"/>
+          </w:tcPr>
+          <w:p>
+            <w:pPr>
+              <w:spacing w:after="0" w:line="240" w:lineRule="auto"/>
+              <w:ind w:firstLine="0"/>
+            </w:pPr>
+            <w:r/>
+            <w:r>
+              <w:rPr>
+                <w:sz w:val="20"/>
+              </w:rPr>
+              <w:t>0,980178</w:t>
+            </w:r>
+          </w:p>
+        </w:tc>
+        <w:tc>
+          <w:tcPr>
+            <w:tcW w:type="dxa" w:w="1417"/>
+          </w:tcPr>
+          <w:p>
+            <w:pPr>
+              <w:spacing w:after="0" w:line="240" w:lineRule="auto"/>
+              <w:ind w:firstLine="0"/>
+            </w:pPr>
+            <w:r/>
+            <w:r>
+              <w:rPr>
+                <w:sz w:val="20"/>
+              </w:rPr>
+              <w:t>1,8·10⁻⁷</w:t>
+            </w:r>
+          </w:p>
+        </w:tc>
+      </w:tr>
+      <w:tr>
+        <w:tc>
+          <w:tcPr>
+            <w:tcW w:type="dxa" w:w="1247"/>
+          </w:tcPr>
+          <w:p>
+            <w:pPr>
+              <w:spacing w:after="0" w:line="240" w:lineRule="auto"/>
+              <w:ind w:firstLine="0"/>
+            </w:pPr>
+            <w:r/>
+            <w:r>
+              <w:rPr>
+                <w:sz w:val="20"/>
+              </w:rPr>
+              <w:t>507388</w:t>
+            </w:r>
+          </w:p>
+        </w:tc>
+        <w:tc>
+          <w:tcPr>
+            <w:tcW w:type="dxa" w:w="3118"/>
+          </w:tcPr>
+          <w:p>
+            <w:pPr>
+              <w:spacing w:after="0" w:line="240" w:lineRule="auto"/>
+              <w:ind w:firstLine="0"/>
+            </w:pPr>
+            <w:r/>
+            <w:r>
+              <w:rPr>
+                <w:sz w:val="20"/>
+              </w:rPr>
+              <w:t>Lung Opacity</w:t>
+            </w:r>
+          </w:p>
+        </w:tc>
+        <w:tc>
+          <w:tcPr>
+            <w:tcW w:type="dxa" w:w="1361"/>
+          </w:tcPr>
+          <w:p>
+            <w:pPr>
+              <w:spacing w:after="0" w:line="240" w:lineRule="auto"/>
+              <w:ind w:firstLine="0"/>
+            </w:pPr>
+            <w:r/>
+            <w:r>
+              <w:rPr>
+                <w:sz w:val="20"/>
+              </w:rPr>
+              <w:t>0,809503</w:t>
+            </w:r>
+          </w:p>
+        </w:tc>
+        <w:tc>
+          <w:tcPr>
+            <w:tcW w:type="dxa" w:w="1361"/>
+          </w:tcPr>
+          <w:p>
+            <w:pPr>
+              <w:spacing w:after="0" w:line="240" w:lineRule="auto"/>
+              <w:ind w:firstLine="0"/>
+            </w:pPr>
+            <w:r/>
+            <w:r>
+              <w:rPr>
+                <w:sz w:val="20"/>
+              </w:rPr>
+              <w:t>0,809503</w:t>
+            </w:r>
+          </w:p>
+        </w:tc>
+        <w:tc>
+          <w:tcPr>
+            <w:tcW w:type="dxa" w:w="1417"/>
+          </w:tcPr>
+          <w:p>
+            <w:pPr>
+              <w:spacing w:after="0" w:line="240" w:lineRule="auto"/>
+              <w:ind w:firstLine="0"/>
+            </w:pPr>
+            <w:r/>
+            <w:r>
+              <w:rPr>
+                <w:sz w:val="20"/>
+              </w:rPr>
+              <w:t>2,6·10⁻⁷</w:t>
+            </w:r>
+          </w:p>
+        </w:tc>
+      </w:tr>
+      <w:tr>
+        <w:tc>
+          <w:tcPr>
+            <w:tcW w:type="dxa" w:w="1247"/>
+          </w:tcPr>
+          <w:p>
+            <w:pPr>
+              <w:spacing w:after="0" w:line="240" w:lineRule="auto"/>
+              <w:ind w:firstLine="0"/>
+            </w:pPr>
+            <w:r/>
+            <w:r>
+              <w:rPr>
+                <w:sz w:val="20"/>
+              </w:rPr>
+              <w:t>287366</w:t>
+            </w:r>
+          </w:p>
+        </w:tc>
+        <w:tc>
+          <w:tcPr>
+            <w:tcW w:type="dxa" w:w="3118"/>
+          </w:tcPr>
+          <w:p>
+            <w:pPr>
+              <w:spacing w:after="0" w:line="240" w:lineRule="auto"/>
+              <w:ind w:firstLine="0"/>
+            </w:pPr>
+            <w:r/>
+            <w:r>
+              <w:rPr>
+                <w:sz w:val="20"/>
+              </w:rPr>
+              <w:t>Normal</w:t>
+            </w:r>
+          </w:p>
+        </w:tc>
+        <w:tc>
+          <w:tcPr>
+            <w:tcW w:type="dxa" w:w="1361"/>
+          </w:tcPr>
+          <w:p>
+            <w:pPr>
+              <w:spacing w:after="0" w:line="240" w:lineRule="auto"/>
+              <w:ind w:firstLine="0"/>
+            </w:pPr>
+            <w:r/>
+            <w:r>
+              <w:rPr>
+                <w:sz w:val="20"/>
+              </w:rPr>
+              <w:t>0,017939</w:t>
+            </w:r>
+          </w:p>
+        </w:tc>
+        <w:tc>
+          <w:tcPr>
+            <w:tcW w:type="dxa" w:w="1361"/>
+          </w:tcPr>
+          <w:p>
+            <w:pPr>
+              <w:spacing w:after="0" w:line="240" w:lineRule="auto"/>
+              <w:ind w:firstLine="0"/>
+            </w:pPr>
+            <w:r/>
+            <w:r>
+              <w:rPr>
+                <w:sz w:val="20"/>
+              </w:rPr>
+              <w:t>0,017939</w:t>
+            </w:r>
+          </w:p>
+        </w:tc>
+        <w:tc>
+          <w:tcPr>
+            <w:tcW w:type="dxa" w:w="1417"/>
+          </w:tcPr>
+          <w:p>
+            <w:pPr>
+              <w:spacing w:after="0" w:line="240" w:lineRule="auto"/>
+              <w:ind w:firstLine="0"/>
+            </w:pPr>
+            <w:r/>
+            <w:r>
+              <w:rPr>
+                <w:sz w:val="20"/>
+              </w:rPr>
+              <w:t>1,2·10⁻⁸</w:t>
+            </w:r>
+          </w:p>
+        </w:tc>
+      </w:tr>
+      <w:tr>
+        <w:tc>
+          <w:tcPr>
+            <w:tcW w:type="dxa" w:w="1247"/>
+          </w:tcPr>
+          <w:p>
+            <w:pPr>
+              <w:spacing w:after="0" w:line="240" w:lineRule="auto"/>
+              <w:ind w:firstLine="0"/>
+            </w:pPr>
+            <w:r/>
+            <w:r>
+              <w:rPr>
+                <w:sz w:val="20"/>
+              </w:rPr>
+              <w:t>448931</w:t>
+            </w:r>
+          </w:p>
+        </w:tc>
+        <w:tc>
+          <w:tcPr>
+            <w:tcW w:type="dxa" w:w="3118"/>
+          </w:tcPr>
+          <w:p>
+            <w:pPr>
+              <w:spacing w:after="0" w:line="240" w:lineRule="auto"/>
+              <w:ind w:firstLine="0"/>
+            </w:pPr>
+            <w:r/>
+            <w:r>
+              <w:rPr>
+                <w:sz w:val="20"/>
+              </w:rPr>
+              <w:t>Normal</w:t>
+            </w:r>
+          </w:p>
+        </w:tc>
+        <w:tc>
+          <w:tcPr>
+            <w:tcW w:type="dxa" w:w="1361"/>
+          </w:tcPr>
+          <w:p>
+            <w:pPr>
+              <w:spacing w:after="0" w:line="240" w:lineRule="auto"/>
+              <w:ind w:firstLine="0"/>
+            </w:pPr>
+            <w:r/>
+            <w:r>
+              <w:rPr>
+                <w:sz w:val="20"/>
+              </w:rPr>
+              <w:t>0,013253</w:t>
+            </w:r>
+          </w:p>
+        </w:tc>
+        <w:tc>
+          <w:tcPr>
+            <w:tcW w:type="dxa" w:w="1361"/>
+          </w:tcPr>
+          <w:p>
+            <w:pPr>
+              <w:spacing w:after="0" w:line="240" w:lineRule="auto"/>
+              <w:ind w:firstLine="0"/>
+            </w:pPr>
+            <w:r/>
+            <w:r>
+              <w:rPr>
+                <w:sz w:val="20"/>
+              </w:rPr>
+              <w:t>0,013253</w:t>
+            </w:r>
+          </w:p>
+        </w:tc>
+        <w:tc>
+          <w:tcPr>
+            <w:tcW w:type="dxa" w:w="1417"/>
+          </w:tcPr>
+          <w:p>
+            <w:pPr>
+              <w:spacing w:after="0" w:line="240" w:lineRule="auto"/>
+              <w:ind w:firstLine="0"/>
+            </w:pPr>
+            <w:r/>
+            <w:r>
+              <w:rPr>
+                <w:sz w:val="20"/>
+              </w:rPr>
+              <w:t>2,3·10⁻⁷</w:t>
+            </w:r>
+          </w:p>
+        </w:tc>
+      </w:tr>
+      <w:tr>
+        <w:tc>
+          <w:tcPr>
+            <w:tcW w:type="dxa" w:w="1247"/>
+          </w:tcPr>
+          <w:p>
+            <w:pPr>
+              <w:spacing w:after="0" w:line="240" w:lineRule="auto"/>
+              <w:ind w:firstLine="0"/>
+            </w:pPr>
+            <w:r/>
+            <w:r>
+              <w:rPr>
+                <w:sz w:val="20"/>
+              </w:rPr>
+              <w:t>191950</w:t>
+            </w:r>
+          </w:p>
+        </w:tc>
+        <w:tc>
+          <w:tcPr>
+            <w:tcW w:type="dxa" w:w="3118"/>
+          </w:tcPr>
+          <w:p>
+            <w:pPr>
+              <w:spacing w:after="0" w:line="240" w:lineRule="auto"/>
+              <w:ind w:firstLine="0"/>
+            </w:pPr>
+            <w:r/>
+            <w:r>
+              <w:rPr>
+                <w:sz w:val="20"/>
+              </w:rPr>
+              <w:t>No Lung Opacity / Not Normal</w:t>
+            </w:r>
+          </w:p>
+        </w:tc>
+        <w:tc>
+          <w:tcPr>
+            <w:tcW w:type="dxa" w:w="1361"/>
+          </w:tcPr>
+          <w:p>
+            <w:pPr>
+              <w:spacing w:after="0" w:line="240" w:lineRule="auto"/>
+              <w:ind w:firstLine="0"/>
+            </w:pPr>
+            <w:r/>
+            <w:r>
+              <w:rPr>
+                <w:sz w:val="20"/>
+              </w:rPr>
+              <w:t>0,607704</w:t>
+            </w:r>
+          </w:p>
+        </w:tc>
+        <w:tc>
+          <w:tcPr>
+            <w:tcW w:type="dxa" w:w="1361"/>
+          </w:tcPr>
+          <w:p>
+            <w:pPr>
+              <w:spacing w:after="0" w:line="240" w:lineRule="auto"/>
+              <w:ind w:firstLine="0"/>
+            </w:pPr>
+            <w:r/>
+            <w:r>
+              <w:rPr>
+                <w:sz w:val="20"/>
+              </w:rPr>
+              <w:t>0,607704</w:t>
+            </w:r>
+          </w:p>
+        </w:tc>
+        <w:tc>
+          <w:tcPr>
+            <w:tcW w:type="dxa" w:w="1417"/>
+          </w:tcPr>
+          <w:p>
+            <w:pPr>
+              <w:spacing w:after="0" w:line="240" w:lineRule="auto"/>
+              <w:ind w:firstLine="0"/>
+            </w:pPr>
+            <w:r/>
+            <w:r>
+              <w:rPr>
+                <w:sz w:val="20"/>
+              </w:rPr>
+              <w:t>1,0·10⁻⁷</w:t>
+            </w:r>
+          </w:p>
+        </w:tc>
+      </w:tr>
+      <w:tr>
+        <w:tc>
+          <w:tcPr>
+            <w:tcW w:type="dxa" w:w="1247"/>
+          </w:tcPr>
+          <w:p>
+            <w:pPr>
+              <w:spacing w:after="0" w:line="240" w:lineRule="auto"/>
+              <w:ind w:firstLine="0"/>
+            </w:pPr>
+            <w:r/>
+            <w:r>
+              <w:rPr>
+                <w:sz w:val="20"/>
+              </w:rPr>
+              <w:t>294012</w:t>
+            </w:r>
+          </w:p>
+        </w:tc>
+        <w:tc>
+          <w:tcPr>
+            <w:tcW w:type="dxa" w:w="3118"/>
+          </w:tcPr>
+          <w:p>
+            <w:pPr>
+              <w:spacing w:after="0" w:line="240" w:lineRule="auto"/>
+              <w:ind w:firstLine="0"/>
+            </w:pPr>
+            <w:r/>
+            <w:r>
+              <w:rPr>
+                <w:sz w:val="20"/>
+              </w:rPr>
+              <w:t>No Lung Opacity / Not Normal</w:t>
+            </w:r>
+          </w:p>
+        </w:tc>
+        <w:tc>
+          <w:tcPr>
+            <w:tcW w:type="dxa" w:w="1361"/>
+          </w:tcPr>
+          <w:p>
+            <w:pPr>
+              <w:spacing w:after="0" w:line="240" w:lineRule="auto"/>
+              <w:ind w:firstLine="0"/>
+            </w:pPr>
+            <w:r/>
+            <w:r>
+              <w:rPr>
+                <w:sz w:val="20"/>
+              </w:rPr>
+              <w:t>0,312609</w:t>
+            </w:r>
+          </w:p>
+        </w:tc>
+        <w:tc>
+          <w:tcPr>
+            <w:tcW w:type="dxa" w:w="1361"/>
+          </w:tcPr>
+          <w:p>
+            <w:pPr>
+              <w:spacing w:after="0" w:line="240" w:lineRule="auto"/>
+              <w:ind w:firstLine="0"/>
+            </w:pPr>
+            <w:r/>
+            <w:r>
+              <w:rPr>
+                <w:sz w:val="20"/>
+              </w:rPr>
+              <w:t>0,312608</w:t>
+            </w:r>
+          </w:p>
+        </w:tc>
+        <w:tc>
+          <w:tcPr>
+            <w:tcW w:type="dxa" w:w="1417"/>
+          </w:tcPr>
+          <w:p>
+            <w:pPr>
+              <w:spacing w:after="0" w:line="240" w:lineRule="auto"/>
+              <w:ind w:firstLine="0"/>
+            </w:pPr>
+            <w:r/>
+            <w:r>
+              <w:rPr>
+                <w:sz w:val="20"/>
+              </w:rPr>
+              <w:t>7,9·10⁻⁷</w:t>
+            </w:r>
+          </w:p>
+        </w:tc>
+      </w:tr>
+    </w:tbl>
+    <w:p>
+      <w:pPr>
+        <w:spacing w:after="0"/>
+      </w:pPr>
+    </w:p>
+    <w:p>
+      <w:pPr>
+        <w:spacing w:before="40" w:after="200" w:line="240" w:lineRule="auto"/>
+        <w:ind w:firstLine="0"/>
+      </w:pPr>
+      <w:r>
+        <w:rPr>
+          <w:i/>
+          <w:sz w:val="22"/>
+        </w:rPr>
+        <w:t>Таблиця 11.2 — Порівняння ймовірностей: настільний конвеєр проти препроцесингу застосунку (той самий граф ONNX з обох боків)</w:t>
+      </w:r>
+    </w:p>
+    <w:p>
+      <w:pPr>
+        <w:pStyle w:val="Heading2"/>
+      </w:pPr>
+      <w:r>
+        <w:t>11.3. Перевірка на фізичному пристрої</w:t>
+      </w:r>
+    </w:p>
+    <w:p>
+      <w:pPr>
+        <w:spacing w:after="120"/>
+        <w:ind w:firstLine="709"/>
+        <w:jc w:val="both"/>
+      </w:pPr>
+      <w:r>
+        <w:rPr>
+          <w:b w:val="0"/>
+          <w:i w:val="0"/>
+        </w:rPr>
+        <w:t>Наскрізний прогін виконано на смартфоні Xiaomi 2306EPN60G (Android 15, API 35, архітектура arm64) у режимі налагодження, постачальник виконання — центральний процесор. Ті самі шість знімків, що й у настільній перевірці, оброблено конвеєром застосунку від файлу PNG до готового результату.</w:t>
+      </w:r>
+    </w:p>
+    <w:tbl>
+      <w:tblPr>
+        <w:tblStyle w:val="TableGrid"/>
+        <w:tblW w:type="auto" w:w="0"/>
+        <w:jc w:val="center"/>
+        <w:tblLook w:firstColumn="1" w:firstRow="1" w:lastColumn="0" w:lastRow="0" w:noHBand="0" w:noVBand="1" w:val="04A0"/>
+      </w:tblPr>
+      <w:tblGrid>
+        <w:gridCol w:w="1615"/>
+        <w:gridCol w:w="1615"/>
+        <w:gridCol w:w="1615"/>
+        <w:gridCol w:w="1615"/>
+        <w:gridCol w:w="1615"/>
+        <w:gridCol w:w="1615"/>
+      </w:tblGrid>
+      <w:tr>
+        <w:tc>
+          <w:tcPr>
+            <w:tcW w:type="dxa" w:w="1134"/>
+            <w:shd w:val="clear" w:color="auto" w:fill="DCE6F1"/>
+          </w:tcPr>
+          <w:p>
+            <w:pPr>
+              <w:spacing w:after="0" w:line="240" w:lineRule="auto"/>
+              <w:ind w:firstLine="0"/>
+            </w:pPr>
+            <w:r/>
+            <w:r>
+              <w:rPr>
+                <w:b/>
+                <w:sz w:val="20"/>
+              </w:rPr>
+              <w:t>Знімок</w:t>
+            </w:r>
+          </w:p>
+        </w:tc>
+        <w:tc>
+          <w:tcPr>
+            <w:tcW w:type="dxa" w:w="2608"/>
+            <w:shd w:val="clear" w:color="auto" w:fill="DCE6F1"/>
+          </w:tcPr>
+          <w:p>
+            <w:pPr>
+              <w:spacing w:after="0" w:line="240" w:lineRule="auto"/>
+              <w:ind w:firstLine="0"/>
+            </w:pPr>
+            <w:r/>
+            <w:r>
+              <w:rPr>
+                <w:b/>
+                <w:sz w:val="20"/>
+              </w:rPr>
+              <w:t>Клас</w:t>
+            </w:r>
+          </w:p>
+        </w:tc>
+        <w:tc>
+          <w:tcPr>
+            <w:tcW w:type="dxa" w:w="1361"/>
+            <w:shd w:val="clear" w:color="auto" w:fill="DCE6F1"/>
+          </w:tcPr>
+          <w:p>
+            <w:pPr>
+              <w:spacing w:after="0" w:line="240" w:lineRule="auto"/>
+              <w:ind w:firstLine="0"/>
+            </w:pPr>
+            <w:r/>
+            <w:r>
+              <w:rPr>
+                <w:b/>
+                <w:sz w:val="20"/>
+              </w:rPr>
+              <w:t>Настільний ПК</w:t>
+            </w:r>
+          </w:p>
+        </w:tc>
+        <w:tc>
+          <w:tcPr>
+            <w:tcW w:type="dxa" w:w="1247"/>
+            <w:shd w:val="clear" w:color="auto" w:fill="DCE6F1"/>
+          </w:tcPr>
+          <w:p>
+            <w:pPr>
+              <w:spacing w:after="0" w:line="240" w:lineRule="auto"/>
+              <w:ind w:firstLine="0"/>
+            </w:pPr>
+            <w:r/>
+            <w:r>
+              <w:rPr>
+                <w:b/>
+                <w:sz w:val="20"/>
+              </w:rPr>
+              <w:t>Android</w:t>
+            </w:r>
+          </w:p>
+        </w:tc>
+        <w:tc>
+          <w:tcPr>
+            <w:tcW w:type="dxa" w:w="1247"/>
+            <w:shd w:val="clear" w:color="auto" w:fill="DCE6F1"/>
+          </w:tcPr>
+          <w:p>
+            <w:pPr>
+              <w:spacing w:after="0" w:line="240" w:lineRule="auto"/>
+              <w:ind w:firstLine="0"/>
+            </w:pPr>
+            <w:r/>
+            <w:r>
+              <w:rPr>
+                <w:b/>
+                <w:sz w:val="20"/>
+              </w:rPr>
+              <w:t>|Δp|</w:t>
+            </w:r>
+          </w:p>
+        </w:tc>
+        <w:tc>
+          <w:tcPr>
+            <w:tcW w:type="dxa" w:w="1191"/>
+            <w:shd w:val="clear" w:color="auto" w:fill="DCE6F1"/>
+          </w:tcPr>
+          <w:p>
+            <w:pPr>
+              <w:spacing w:after="0" w:line="240" w:lineRule="auto"/>
+              <w:ind w:firstLine="0"/>
+            </w:pPr>
+            <w:r/>
+            <w:r>
+              <w:rPr>
+                <w:b/>
+                <w:sz w:val="20"/>
+              </w:rPr>
+              <w:t>Вердикт</w:t>
+            </w:r>
+          </w:p>
+        </w:tc>
+      </w:tr>
+      <w:tr>
+        <w:tc>
+          <w:tcPr>
+            <w:tcW w:type="dxa" w:w="1134"/>
+          </w:tcPr>
+          <w:p>
+            <w:pPr>
+              <w:spacing w:after="0" w:line="240" w:lineRule="auto"/>
+              <w:ind w:firstLine="0"/>
+            </w:pPr>
+            <w:r/>
+            <w:r>
+              <w:rPr>
+                <w:sz w:val="20"/>
+              </w:rPr>
+              <w:t>509903</w:t>
+            </w:r>
+          </w:p>
+        </w:tc>
+        <w:tc>
+          <w:tcPr>
+            <w:tcW w:type="dxa" w:w="2608"/>
+          </w:tcPr>
+          <w:p>
+            <w:pPr>
+              <w:spacing w:after="0" w:line="240" w:lineRule="auto"/>
+              <w:ind w:firstLine="0"/>
+            </w:pPr>
+            <w:r/>
+            <w:r>
+              <w:rPr>
+                <w:sz w:val="20"/>
+              </w:rPr>
+              <w:t>Lung Opacity</w:t>
+            </w:r>
+          </w:p>
+        </w:tc>
+        <w:tc>
+          <w:tcPr>
+            <w:tcW w:type="dxa" w:w="1361"/>
+          </w:tcPr>
+          <w:p>
+            <w:pPr>
+              <w:spacing w:after="0" w:line="240" w:lineRule="auto"/>
+              <w:ind w:firstLine="0"/>
+            </w:pPr>
+            <w:r/>
+            <w:r>
+              <w:rPr>
+                <w:sz w:val="20"/>
+              </w:rPr>
+              <w:t>0,980178</w:t>
+            </w:r>
+          </w:p>
+        </w:tc>
+        <w:tc>
+          <w:tcPr>
+            <w:tcW w:type="dxa" w:w="1247"/>
+          </w:tcPr>
+          <w:p>
+            <w:pPr>
+              <w:spacing w:after="0" w:line="240" w:lineRule="auto"/>
+              <w:ind w:firstLine="0"/>
+            </w:pPr>
+            <w:r/>
+            <w:r>
+              <w:rPr>
+                <w:sz w:val="20"/>
+              </w:rPr>
+              <w:t>0,980178</w:t>
+            </w:r>
+          </w:p>
+        </w:tc>
+        <w:tc>
+          <w:tcPr>
+            <w:tcW w:type="dxa" w:w="1247"/>
+          </w:tcPr>
+          <w:p>
+            <w:pPr>
+              <w:spacing w:after="0" w:line="240" w:lineRule="auto"/>
+              <w:ind w:firstLine="0"/>
+            </w:pPr>
+            <w:r/>
+            <w:r>
+              <w:rPr>
+                <w:sz w:val="20"/>
+              </w:rPr>
+              <w:t>1,96·10⁻⁷</w:t>
+            </w:r>
+          </w:p>
+        </w:tc>
+        <w:tc>
+          <w:tcPr>
+            <w:tcW w:type="dxa" w:w="1191"/>
+          </w:tcPr>
+          <w:p>
+            <w:pPr>
+              <w:spacing w:after="0" w:line="240" w:lineRule="auto"/>
+              <w:ind w:firstLine="0"/>
+            </w:pPr>
+            <w:r/>
+            <w:r>
+              <w:rPr>
+                <w:sz w:val="20"/>
+              </w:rPr>
+              <w:t>виявлено</w:t>
+            </w:r>
+          </w:p>
+        </w:tc>
+      </w:tr>
+      <w:tr>
+        <w:tc>
+          <w:tcPr>
+            <w:tcW w:type="dxa" w:w="1134"/>
+          </w:tcPr>
+          <w:p>
+            <w:pPr>
+              <w:spacing w:after="0" w:line="240" w:lineRule="auto"/>
+              <w:ind w:firstLine="0"/>
+            </w:pPr>
+            <w:r/>
+            <w:r>
+              <w:rPr>
+                <w:sz w:val="20"/>
+              </w:rPr>
+              <w:t>507388</w:t>
+            </w:r>
+          </w:p>
+        </w:tc>
+        <w:tc>
+          <w:tcPr>
+            <w:tcW w:type="dxa" w:w="2608"/>
+          </w:tcPr>
+          <w:p>
+            <w:pPr>
+              <w:spacing w:after="0" w:line="240" w:lineRule="auto"/>
+              <w:ind w:firstLine="0"/>
+            </w:pPr>
+            <w:r/>
+            <w:r>
+              <w:rPr>
+                <w:sz w:val="20"/>
+              </w:rPr>
+              <w:t>Lung Opacity</w:t>
+            </w:r>
+          </w:p>
+        </w:tc>
+        <w:tc>
+          <w:tcPr>
+            <w:tcW w:type="dxa" w:w="1361"/>
+          </w:tcPr>
+          <w:p>
+            <w:pPr>
+              <w:spacing w:after="0" w:line="240" w:lineRule="auto"/>
+              <w:ind w:firstLine="0"/>
+            </w:pPr>
+            <w:r/>
+            <w:r>
+              <w:rPr>
+                <w:sz w:val="20"/>
+              </w:rPr>
+              <w:t>0,809503</w:t>
+            </w:r>
+          </w:p>
+        </w:tc>
+        <w:tc>
+          <w:tcPr>
+            <w:tcW w:type="dxa" w:w="1247"/>
+          </w:tcPr>
+          <w:p>
+            <w:pPr>
+              <w:spacing w:after="0" w:line="240" w:lineRule="auto"/>
+              <w:ind w:firstLine="0"/>
+            </w:pPr>
+            <w:r/>
+            <w:r>
+              <w:rPr>
+                <w:sz w:val="20"/>
+              </w:rPr>
+              <w:t>0,809503</w:t>
+            </w:r>
+          </w:p>
+        </w:tc>
+        <w:tc>
+          <w:tcPr>
+            <w:tcW w:type="dxa" w:w="1247"/>
+          </w:tcPr>
+          <w:p>
+            <w:pPr>
+              <w:spacing w:after="0" w:line="240" w:lineRule="auto"/>
+              <w:ind w:firstLine="0"/>
+            </w:pPr>
+            <w:r/>
+            <w:r>
+              <w:rPr>
+                <w:sz w:val="20"/>
+              </w:rPr>
+              <w:t>2,55·10⁻⁷</w:t>
+            </w:r>
+          </w:p>
+        </w:tc>
+        <w:tc>
+          <w:tcPr>
+            <w:tcW w:type="dxa" w:w="1191"/>
+          </w:tcPr>
+          <w:p>
+            <w:pPr>
+              <w:spacing w:after="0" w:line="240" w:lineRule="auto"/>
+              <w:ind w:firstLine="0"/>
+            </w:pPr>
+            <w:r/>
+            <w:r>
+              <w:rPr>
+                <w:sz w:val="20"/>
+              </w:rPr>
+              <w:t>виявлено</w:t>
+            </w:r>
+          </w:p>
+        </w:tc>
+      </w:tr>
+      <w:tr>
+        <w:tc>
+          <w:tcPr>
+            <w:tcW w:type="dxa" w:w="1134"/>
+          </w:tcPr>
+          <w:p>
+            <w:pPr>
+              <w:spacing w:after="0" w:line="240" w:lineRule="auto"/>
+              <w:ind w:firstLine="0"/>
+            </w:pPr>
+            <w:r/>
+            <w:r>
+              <w:rPr>
+                <w:sz w:val="20"/>
+              </w:rPr>
+              <w:t>287366</w:t>
+            </w:r>
+          </w:p>
+        </w:tc>
+        <w:tc>
+          <w:tcPr>
+            <w:tcW w:type="dxa" w:w="2608"/>
+          </w:tcPr>
+          <w:p>
+            <w:pPr>
+              <w:spacing w:after="0" w:line="240" w:lineRule="auto"/>
+              <w:ind w:firstLine="0"/>
+            </w:pPr>
+            <w:r/>
+            <w:r>
+              <w:rPr>
+                <w:sz w:val="20"/>
+              </w:rPr>
+              <w:t>Normal</w:t>
+            </w:r>
+          </w:p>
+        </w:tc>
+        <w:tc>
+          <w:tcPr>
+            <w:tcW w:type="dxa" w:w="1361"/>
+          </w:tcPr>
+          <w:p>
+            <w:pPr>
+              <w:spacing w:after="0" w:line="240" w:lineRule="auto"/>
+              <w:ind w:firstLine="0"/>
+            </w:pPr>
+            <w:r/>
+            <w:r>
+              <w:rPr>
+                <w:sz w:val="20"/>
+              </w:rPr>
+              <w:t>0,017939</w:t>
+            </w:r>
+          </w:p>
+        </w:tc>
+        <w:tc>
+          <w:tcPr>
+            <w:tcW w:type="dxa" w:w="1247"/>
+          </w:tcPr>
+          <w:p>
+            <w:pPr>
+              <w:spacing w:after="0" w:line="240" w:lineRule="auto"/>
+              <w:ind w:firstLine="0"/>
+            </w:pPr>
+            <w:r/>
+            <w:r>
+              <w:rPr>
+                <w:sz w:val="20"/>
+              </w:rPr>
+              <w:t>0,017939</w:t>
+            </w:r>
+          </w:p>
+        </w:tc>
+        <w:tc>
+          <w:tcPr>
+            <w:tcW w:type="dxa" w:w="1247"/>
+          </w:tcPr>
+          <w:p>
+            <w:pPr>
+              <w:spacing w:after="0" w:line="240" w:lineRule="auto"/>
+              <w:ind w:firstLine="0"/>
+            </w:pPr>
+            <w:r/>
+            <w:r>
+              <w:rPr>
+                <w:sz w:val="20"/>
+              </w:rPr>
+              <w:t>1,15·10⁻⁸</w:t>
+            </w:r>
+          </w:p>
+        </w:tc>
+        <w:tc>
+          <w:tcPr>
+            <w:tcW w:type="dxa" w:w="1191"/>
+          </w:tcPr>
+          <w:p>
+            <w:pPr>
+              <w:spacing w:after="0" w:line="240" w:lineRule="auto"/>
+              <w:ind w:firstLine="0"/>
+            </w:pPr>
+            <w:r/>
+            <w:r>
+              <w:rPr>
+                <w:sz w:val="20"/>
+              </w:rPr>
+              <w:t>не виявлено</w:t>
+            </w:r>
+          </w:p>
+        </w:tc>
+      </w:tr>
+      <w:tr>
+        <w:tc>
+          <w:tcPr>
+            <w:tcW w:type="dxa" w:w="1134"/>
+          </w:tcPr>
+          <w:p>
+            <w:pPr>
+              <w:spacing w:after="0" w:line="240" w:lineRule="auto"/>
+              <w:ind w:firstLine="0"/>
+            </w:pPr>
+            <w:r/>
+            <w:r>
+              <w:rPr>
+                <w:sz w:val="20"/>
+              </w:rPr>
+              <w:t>448931</w:t>
+            </w:r>
+          </w:p>
+        </w:tc>
+        <w:tc>
+          <w:tcPr>
+            <w:tcW w:type="dxa" w:w="2608"/>
+          </w:tcPr>
+          <w:p>
+            <w:pPr>
+              <w:spacing w:after="0" w:line="240" w:lineRule="auto"/>
+              <w:ind w:firstLine="0"/>
+            </w:pPr>
+            <w:r/>
+            <w:r>
+              <w:rPr>
+                <w:sz w:val="20"/>
+              </w:rPr>
+              <w:t>Normal</w:t>
+            </w:r>
+          </w:p>
+        </w:tc>
+        <w:tc>
+          <w:tcPr>
+            <w:tcW w:type="dxa" w:w="1361"/>
+          </w:tcPr>
+          <w:p>
+            <w:pPr>
+              <w:spacing w:after="0" w:line="240" w:lineRule="auto"/>
+              <w:ind w:firstLine="0"/>
+            </w:pPr>
+            <w:r/>
+            <w:r>
+              <w:rPr>
+                <w:sz w:val="20"/>
+              </w:rPr>
+              <w:t>0,013253</w:t>
+            </w:r>
+          </w:p>
+        </w:tc>
+        <w:tc>
+          <w:tcPr>
+            <w:tcW w:type="dxa" w:w="1247"/>
+          </w:tcPr>
+          <w:p>
+            <w:pPr>
+              <w:spacing w:after="0" w:line="240" w:lineRule="auto"/>
+              <w:ind w:firstLine="0"/>
+            </w:pPr>
+            <w:r/>
+            <w:r>
+              <w:rPr>
+                <w:sz w:val="20"/>
+              </w:rPr>
+              <w:t>0,013253</w:t>
+            </w:r>
+          </w:p>
+        </w:tc>
+        <w:tc>
+          <w:tcPr>
+            <w:tcW w:type="dxa" w:w="1247"/>
+          </w:tcPr>
+          <w:p>
+            <w:pPr>
+              <w:spacing w:after="0" w:line="240" w:lineRule="auto"/>
+              <w:ind w:firstLine="0"/>
+            </w:pPr>
+            <w:r/>
+            <w:r>
+              <w:rPr>
+                <w:sz w:val="20"/>
+              </w:rPr>
+              <w:t>2,31·10⁻⁷</w:t>
+            </w:r>
+          </w:p>
+        </w:tc>
+        <w:tc>
+          <w:tcPr>
+            <w:tcW w:type="dxa" w:w="1191"/>
+          </w:tcPr>
+          <w:p>
+            <w:pPr>
+              <w:spacing w:after="0" w:line="240" w:lineRule="auto"/>
+              <w:ind w:firstLine="0"/>
+            </w:pPr>
+            <w:r/>
+            <w:r>
+              <w:rPr>
+                <w:sz w:val="20"/>
+              </w:rPr>
+              <w:t>не виявлено</w:t>
+            </w:r>
+          </w:p>
+        </w:tc>
+      </w:tr>
+      <w:tr>
+        <w:tc>
+          <w:tcPr>
+            <w:tcW w:type="dxa" w:w="1134"/>
+          </w:tcPr>
+          <w:p>
+            <w:pPr>
+              <w:spacing w:after="0" w:line="240" w:lineRule="auto"/>
+              <w:ind w:firstLine="0"/>
+            </w:pPr>
+            <w:r/>
+            <w:r>
+              <w:rPr>
+                <w:sz w:val="20"/>
+              </w:rPr>
+              <w:t>191950</w:t>
+            </w:r>
+          </w:p>
+        </w:tc>
+        <w:tc>
+          <w:tcPr>
+            <w:tcW w:type="dxa" w:w="2608"/>
+          </w:tcPr>
+          <w:p>
+            <w:pPr>
+              <w:spacing w:after="0" w:line="240" w:lineRule="auto"/>
+              <w:ind w:firstLine="0"/>
+            </w:pPr>
+            <w:r/>
+            <w:r>
+              <w:rPr>
+                <w:sz w:val="20"/>
+              </w:rPr>
+              <w:t>No Lung Opacity / Not Normal</w:t>
+            </w:r>
+          </w:p>
+        </w:tc>
+        <w:tc>
+          <w:tcPr>
+            <w:tcW w:type="dxa" w:w="1361"/>
+          </w:tcPr>
+          <w:p>
+            <w:pPr>
+              <w:spacing w:after="0" w:line="240" w:lineRule="auto"/>
+              <w:ind w:firstLine="0"/>
+            </w:pPr>
+            <w:r/>
+            <w:r>
+              <w:rPr>
+                <w:sz w:val="20"/>
+              </w:rPr>
+              <w:t>0,607704</w:t>
+            </w:r>
+          </w:p>
+        </w:tc>
+        <w:tc>
+          <w:tcPr>
+            <w:tcW w:type="dxa" w:w="1247"/>
+          </w:tcPr>
+          <w:p>
+            <w:pPr>
+              <w:spacing w:after="0" w:line="240" w:lineRule="auto"/>
+              <w:ind w:firstLine="0"/>
+            </w:pPr>
+            <w:r/>
+            <w:r>
+              <w:rPr>
+                <w:sz w:val="20"/>
+              </w:rPr>
+              <w:t>0,607704</w:t>
+            </w:r>
+          </w:p>
+        </w:tc>
+        <w:tc>
+          <w:tcPr>
+            <w:tcW w:type="dxa" w:w="1247"/>
+          </w:tcPr>
+          <w:p>
+            <w:pPr>
+              <w:spacing w:after="0" w:line="240" w:lineRule="auto"/>
+              <w:ind w:firstLine="0"/>
+            </w:pPr>
+            <w:r/>
+            <w:r>
+              <w:rPr>
+                <w:sz w:val="20"/>
+              </w:rPr>
+              <w:t>7,33·10⁻⁸</w:t>
+            </w:r>
+          </w:p>
+        </w:tc>
+        <w:tc>
+          <w:tcPr>
+            <w:tcW w:type="dxa" w:w="1191"/>
+          </w:tcPr>
+          <w:p>
+            <w:pPr>
+              <w:spacing w:after="0" w:line="240" w:lineRule="auto"/>
+              <w:ind w:firstLine="0"/>
+            </w:pPr>
+            <w:r/>
+            <w:r>
+              <w:rPr>
+                <w:sz w:val="20"/>
+              </w:rPr>
+              <w:t>виявлено</w:t>
+            </w:r>
+          </w:p>
+        </w:tc>
+      </w:tr>
+      <w:tr>
+        <w:tc>
+          <w:tcPr>
+            <w:tcW w:type="dxa" w:w="1134"/>
+          </w:tcPr>
+          <w:p>
+            <w:pPr>
+              <w:spacing w:after="0" w:line="240" w:lineRule="auto"/>
+              <w:ind w:firstLine="0"/>
+            </w:pPr>
+            <w:r/>
+            <w:r>
+              <w:rPr>
+                <w:sz w:val="20"/>
+              </w:rPr>
+              <w:t>294012</w:t>
+            </w:r>
+          </w:p>
+        </w:tc>
+        <w:tc>
+          <w:tcPr>
+            <w:tcW w:type="dxa" w:w="2608"/>
+          </w:tcPr>
+          <w:p>
+            <w:pPr>
+              <w:spacing w:after="0" w:line="240" w:lineRule="auto"/>
+              <w:ind w:firstLine="0"/>
+            </w:pPr>
+            <w:r/>
+            <w:r>
+              <w:rPr>
+                <w:sz w:val="20"/>
+              </w:rPr>
+              <w:t>No Lung Opacity / Not Normal</w:t>
+            </w:r>
+          </w:p>
+        </w:tc>
+        <w:tc>
+          <w:tcPr>
+            <w:tcW w:type="dxa" w:w="1361"/>
+          </w:tcPr>
+          <w:p>
+            <w:pPr>
+              <w:spacing w:after="0" w:line="240" w:lineRule="auto"/>
+              <w:ind w:firstLine="0"/>
+            </w:pPr>
+            <w:r/>
+            <w:r>
+              <w:rPr>
+                <w:sz w:val="20"/>
+              </w:rPr>
+              <w:t>0,312609</w:t>
+            </w:r>
+          </w:p>
+        </w:tc>
+        <w:tc>
+          <w:tcPr>
+            <w:tcW w:type="dxa" w:w="1247"/>
+          </w:tcPr>
+          <w:p>
+            <w:pPr>
+              <w:spacing w:after="0" w:line="240" w:lineRule="auto"/>
+              <w:ind w:firstLine="0"/>
+            </w:pPr>
+            <w:r/>
+            <w:r>
+              <w:rPr>
+                <w:sz w:val="20"/>
+              </w:rPr>
+              <w:t>0,312608</w:t>
+            </w:r>
+          </w:p>
+        </w:tc>
+        <w:tc>
+          <w:tcPr>
+            <w:tcW w:type="dxa" w:w="1247"/>
+          </w:tcPr>
+          <w:p>
+            <w:pPr>
+              <w:spacing w:after="0" w:line="240" w:lineRule="auto"/>
+              <w:ind w:firstLine="0"/>
+            </w:pPr>
+            <w:r/>
+            <w:r>
+              <w:rPr>
+                <w:sz w:val="20"/>
+              </w:rPr>
+              <w:t>7,89·10⁻⁷</w:t>
+            </w:r>
+          </w:p>
+        </w:tc>
+        <w:tc>
+          <w:tcPr>
+            <w:tcW w:type="dxa" w:w="1191"/>
+          </w:tcPr>
+          <w:p>
+            <w:pPr>
+              <w:spacing w:after="0" w:line="240" w:lineRule="auto"/>
+              <w:ind w:firstLine="0"/>
+            </w:pPr>
+            <w:r/>
+            <w:r>
+              <w:rPr>
+                <w:sz w:val="20"/>
+              </w:rPr>
+              <w:t>не виявлено</w:t>
+            </w:r>
+          </w:p>
+        </w:tc>
+      </w:tr>
+    </w:tbl>
+    <w:p>
+      <w:pPr>
+        <w:spacing w:after="0"/>
+      </w:pPr>
+    </w:p>
+    <w:p>
+      <w:pPr>
+        <w:spacing w:before="40" w:after="200" w:line="240" w:lineRule="auto"/>
+        <w:ind w:firstLine="0"/>
+      </w:pPr>
+      <w:r>
+        <w:rPr>
+          <w:i/>
+          <w:sz w:val="22"/>
+        </w:rPr>
+        <w:t>Таблиця 11.3 — Порівняння ймовірностей на настільному ПК і на смартфоні; максимальна розбіжність 7,889·10⁻⁷, жоден вердикт не змінився</w:t>
+      </w:r>
+    </w:p>
+    <w:tbl>
+      <w:tblPr>
+        <w:tblStyle w:val="TableGrid"/>
+        <w:tblW w:type="auto" w:w="0"/>
+        <w:jc w:val="center"/>
+        <w:tblLook w:firstColumn="1" w:firstRow="1" w:lastColumn="0" w:lastRow="0" w:noHBand="0" w:noVBand="1" w:val="04A0"/>
+      </w:tblPr>
+      <w:tblGrid>
+        <w:gridCol w:w="4844"/>
+        <w:gridCol w:w="4844"/>
+      </w:tblGrid>
+      <w:tr>
+        <w:tc>
+          <w:tcPr>
+            <w:tcW w:type="dxa" w:w="3402"/>
+            <w:shd w:val="clear" w:color="auto" w:fill="DCE6F1"/>
+          </w:tcPr>
+          <w:p>
+            <w:pPr>
+              <w:spacing w:after="0" w:line="240" w:lineRule="auto"/>
+              <w:ind w:firstLine="0"/>
+            </w:pPr>
+            <w:r/>
+            <w:r>
+              <w:rPr>
+                <w:b/>
+                <w:sz w:val="22"/>
+              </w:rPr>
+              <w:t>Показник</w:t>
+            </w:r>
+          </w:p>
+        </w:tc>
+        <w:tc>
+          <w:tcPr>
+            <w:tcW w:type="dxa" w:w="5386"/>
+            <w:shd w:val="clear" w:color="auto" w:fill="DCE6F1"/>
+          </w:tcPr>
+          <w:p>
+            <w:pPr>
+              <w:spacing w:after="0" w:line="240" w:lineRule="auto"/>
+              <w:ind w:firstLine="0"/>
+            </w:pPr>
+            <w:r/>
+            <w:r>
+              <w:rPr>
+                <w:b/>
+                <w:sz w:val="22"/>
+              </w:rPr>
+              <w:t>Значення</w:t>
+            </w:r>
+          </w:p>
+        </w:tc>
+      </w:tr>
+      <w:tr>
+        <w:tc>
+          <w:tcPr>
+            <w:tcW w:type="dxa" w:w="3402"/>
+          </w:tcPr>
+          <w:p>
+            <w:pPr>
+              <w:spacing w:after="0" w:line="240" w:lineRule="auto"/>
+              <w:ind w:firstLine="0"/>
+            </w:pPr>
+            <w:r/>
+            <w:r>
+              <w:rPr>
+                <w:sz w:val="22"/>
+              </w:rPr>
+              <w:t>Прогрівання (створення сесії)</w:t>
+            </w:r>
+          </w:p>
+        </w:tc>
+        <w:tc>
+          <w:tcPr>
+            <w:tcW w:type="dxa" w:w="5386"/>
+          </w:tcPr>
+          <w:p>
+            <w:pPr>
+              <w:spacing w:after="0" w:line="240" w:lineRule="auto"/>
+              <w:ind w:firstLine="0"/>
+            </w:pPr>
+            <w:r/>
+            <w:r>
+              <w:rPr>
+                <w:sz w:val="22"/>
+              </w:rPr>
+              <w:t>294 мс; повторний виклик — 0 мс, сесія використовується повторно</w:t>
+            </w:r>
+          </w:p>
+        </w:tc>
+      </w:tr>
+      <w:tr>
+        <w:tc>
+          <w:tcPr>
+            <w:tcW w:type="dxa" w:w="3402"/>
+          </w:tcPr>
+          <w:p>
+            <w:pPr>
+              <w:spacing w:after="0" w:line="240" w:lineRule="auto"/>
+              <w:ind w:firstLine="0"/>
+            </w:pPr>
+            <w:r/>
+            <w:r>
+              <w:rPr>
+                <w:sz w:val="22"/>
+              </w:rPr>
+              <w:t>Оброблення одного знімка</w:t>
+            </w:r>
+          </w:p>
+        </w:tc>
+        <w:tc>
+          <w:tcPr>
+            <w:tcW w:type="dxa" w:w="5386"/>
+          </w:tcPr>
+          <w:p>
+            <w:pPr>
+              <w:spacing w:after="0" w:line="240" w:lineRule="auto"/>
+              <w:ind w:firstLine="0"/>
+            </w:pPr>
+            <w:r/>
+            <w:r>
+              <w:rPr>
+                <w:sz w:val="22"/>
+              </w:rPr>
+              <w:t>медіана 214 мс (від 192 до 407 мс; перший знімок включає запуск ізоляту)</w:t>
+            </w:r>
+          </w:p>
+        </w:tc>
+      </w:tr>
+      <w:tr>
+        <w:tc>
+          <w:tcPr>
+            <w:tcW w:type="dxa" w:w="3402"/>
+          </w:tcPr>
+          <w:p>
+            <w:pPr>
+              <w:spacing w:after="0" w:line="240" w:lineRule="auto"/>
+              <w:ind w:firstLine="0"/>
+            </w:pPr>
+            <w:r/>
+            <w:r>
+              <w:rPr>
+                <w:sz w:val="22"/>
+              </w:rPr>
+              <w:t>Максимальна розбіжність</w:t>
+            </w:r>
+          </w:p>
+        </w:tc>
+        <w:tc>
+          <w:tcPr>
+            <w:tcW w:type="dxa" w:w="5386"/>
+          </w:tcPr>
+          <w:p>
+            <w:pPr>
+              <w:spacing w:after="0" w:line="240" w:lineRule="auto"/>
+              <w:ind w:firstLine="0"/>
+            </w:pPr>
+            <w:r/>
+            <w:r>
+              <w:rPr>
+                <w:sz w:val="22"/>
+              </w:rPr>
+              <w:t>7,889·10⁻⁷</w:t>
+            </w:r>
+          </w:p>
+        </w:tc>
+      </w:tr>
+      <w:tr>
+        <w:tc>
+          <w:tcPr>
+            <w:tcW w:type="dxa" w:w="3402"/>
+          </w:tcPr>
+          <w:p>
+            <w:pPr>
+              <w:spacing w:after="0" w:line="240" w:lineRule="auto"/>
+              <w:ind w:firstLine="0"/>
+            </w:pPr>
+            <w:r/>
+            <w:r>
+              <w:rPr>
+                <w:sz w:val="22"/>
+              </w:rPr>
+              <w:t>Середня розбіжність</w:t>
+            </w:r>
+          </w:p>
+        </w:tc>
+        <w:tc>
+          <w:tcPr>
+            <w:tcW w:type="dxa" w:w="5386"/>
+          </w:tcPr>
+          <w:p>
+            <w:pPr>
+              <w:spacing w:after="0" w:line="240" w:lineRule="auto"/>
+              <w:ind w:firstLine="0"/>
+            </w:pPr>
+            <w:r/>
+            <w:r>
+              <w:rPr>
+                <w:sz w:val="22"/>
+              </w:rPr>
+              <w:t>2,593·10⁻⁷</w:t>
+            </w:r>
+          </w:p>
+        </w:tc>
+      </w:tr>
+    </w:tbl>
+    <w:p>
+      <w:pPr>
+        <w:spacing w:after="0"/>
+      </w:pPr>
+    </w:p>
+    <w:p>
+      <w:pPr>
+        <w:spacing w:before="40" w:after="200" w:line="240" w:lineRule="auto"/>
+        <w:ind w:firstLine="0"/>
+      </w:pPr>
+      <w:r>
+        <w:rPr>
+          <w:i/>
+          <w:sz w:val="22"/>
+        </w:rPr>
+        <w:t>Таблиця 11.4 — Швидкодія на смартфоні</w:t>
+      </w:r>
+    </w:p>
+    <w:p>
+      <w:pPr>
+        <w:pStyle w:val="Heading2"/>
+      </w:pPr>
+      <w:r>
+        <w:t>11.4. Обробка помилок і ресурси</w:t>
+      </w:r>
+    </w:p>
+    <w:p>
+      <w:pPr>
+        <w:spacing w:after="120"/>
+        <w:ind w:firstLine="709"/>
+        <w:jc w:val="both"/>
+      </w:pPr>
+      <w:r>
+        <w:rPr>
+          <w:b w:val="0"/>
+          <w:i w:val="0"/>
+        </w:rPr>
+        <w:t>Прогрівання запускається під час старту застосунку, тому перший аналіз не сплачує вартість завантаження моделі; збій прогрівання не є фатальним — спробу буде повторено під час першого аналізу, а повідомлення з’явиться на екрані аналізу. Якщо модель не вдається завантажити, екран повертається до вихідного стану: обране зображення залишається, кнопка знову активна, індикатор очікування не зависає. Звільнення сесії виконується у методі dispose і не здатне аварійно завершити застосунок.</w:t>
+      </w:r>
+    </w:p>
+    <w:tbl>
+      <w:tblPr>
+        <w:tblStyle w:val="TableGrid"/>
+        <w:tblW w:type="auto" w:w="0"/>
+        <w:jc w:val="center"/>
+        <w:tblLook w:firstColumn="1" w:firstRow="1" w:lastColumn="0" w:lastRow="0" w:noHBand="0" w:noVBand="1" w:val="04A0"/>
+      </w:tblPr>
+      <w:tblGrid>
+        <w:gridCol w:w="4844"/>
+        <w:gridCol w:w="4844"/>
+      </w:tblGrid>
+      <w:tr>
+        <w:tc>
+          <w:tcPr>
+            <w:tcW w:type="dxa" w:w="2835"/>
+            <w:shd w:val="clear" w:color="auto" w:fill="DCE6F1"/>
+          </w:tcPr>
+          <w:p>
+            <w:pPr>
+              <w:spacing w:after="0" w:line="240" w:lineRule="auto"/>
+              <w:ind w:firstLine="0"/>
+            </w:pPr>
+            <w:r/>
+            <w:r>
+              <w:rPr>
+                <w:b/>
+                <w:sz w:val="22"/>
+              </w:rPr>
+              <w:t>Показник</w:t>
+            </w:r>
+          </w:p>
+        </w:tc>
+        <w:tc>
+          <w:tcPr>
+            <w:tcW w:type="dxa" w:w="5953"/>
+            <w:shd w:val="clear" w:color="auto" w:fill="DCE6F1"/>
+          </w:tcPr>
+          <w:p>
+            <w:pPr>
+              <w:spacing w:after="0" w:line="240" w:lineRule="auto"/>
+              <w:ind w:firstLine="0"/>
+            </w:pPr>
+            <w:r/>
+            <w:r>
+              <w:rPr>
+                <w:b/>
+                <w:sz w:val="22"/>
+              </w:rPr>
+              <w:t>Значення</w:t>
+            </w:r>
+          </w:p>
+        </w:tc>
+      </w:tr>
+      <w:tr>
+        <w:tc>
+          <w:tcPr>
+            <w:tcW w:type="dxa" w:w="2835"/>
+          </w:tcPr>
+          <w:p>
+            <w:pPr>
+              <w:spacing w:after="0" w:line="240" w:lineRule="auto"/>
+              <w:ind w:firstLine="0"/>
+            </w:pPr>
+            <w:r/>
+            <w:r>
+              <w:rPr>
+                <w:sz w:val="22"/>
+              </w:rPr>
+              <w:t>Формат вхідних зображень</w:t>
+            </w:r>
+          </w:p>
+        </w:tc>
+        <w:tc>
+          <w:tcPr>
+            <w:tcW w:type="dxa" w:w="5953"/>
+          </w:tcPr>
+          <w:p>
+            <w:pPr>
+              <w:spacing w:after="0" w:line="240" w:lineRule="auto"/>
+              <w:ind w:firstLine="0"/>
+            </w:pPr>
+            <w:r/>
+            <w:r>
+              <w:rPr>
+                <w:sz w:val="22"/>
+              </w:rPr>
+              <w:t>PNG / JPEG через наявний вибір із галереї</w:t>
+            </w:r>
+          </w:p>
+        </w:tc>
+      </w:tr>
+      <w:tr>
+        <w:tc>
+          <w:tcPr>
+            <w:tcW w:type="dxa" w:w="2835"/>
+          </w:tcPr>
+          <w:p>
+            <w:pPr>
+              <w:spacing w:after="0" w:line="240" w:lineRule="auto"/>
+              <w:ind w:firstLine="0"/>
+            </w:pPr>
+            <w:r/>
+            <w:r>
+              <w:rPr>
+                <w:sz w:val="22"/>
+              </w:rPr>
+              <w:t>Мінімальна версія Android</w:t>
+            </w:r>
+          </w:p>
+        </w:tc>
+        <w:tc>
+          <w:tcPr>
+            <w:tcW w:type="dxa" w:w="5953"/>
+          </w:tcPr>
+          <w:p>
+            <w:pPr>
+              <w:spacing w:after="0" w:line="240" w:lineRule="auto"/>
+              <w:ind w:firstLine="0"/>
+            </w:pPr>
+            <w:r/>
+            <w:r>
+              <w:rPr>
+                <w:sz w:val="22"/>
+              </w:rPr>
+              <w:t>21 (вимога середовища виконання; зміни збирання не знадобилися)</w:t>
+            </w:r>
+          </w:p>
+        </w:tc>
+      </w:tr>
+      <w:tr>
+        <w:tc>
+          <w:tcPr>
+            <w:tcW w:type="dxa" w:w="2835"/>
+          </w:tcPr>
+          <w:p>
+            <w:pPr>
+              <w:spacing w:after="0" w:line="240" w:lineRule="auto"/>
+              <w:ind w:firstLine="0"/>
+            </w:pPr>
+            <w:r/>
+            <w:r>
+              <w:rPr>
+                <w:sz w:val="22"/>
+              </w:rPr>
+              <w:t>Розмір збірки arm64-v8a</w:t>
+            </w:r>
+          </w:p>
+        </w:tc>
+        <w:tc>
+          <w:tcPr>
+            <w:tcW w:type="dxa" w:w="5953"/>
+          </w:tcPr>
+          <w:p>
+            <w:pPr>
+              <w:spacing w:after="0" w:line="240" w:lineRule="auto"/>
+              <w:ind w:firstLine="0"/>
+            </w:pPr>
+            <w:r/>
+            <w:r>
+              <w:rPr>
+                <w:sz w:val="22"/>
+              </w:rPr>
+              <w:t>60,7 МБ (з них 26,3 МБ — стиснена модель, ~19 МБ — бібліотека середовища виконання)</w:t>
+            </w:r>
+          </w:p>
+        </w:tc>
+      </w:tr>
+      <w:tr>
+        <w:tc>
+          <w:tcPr>
+            <w:tcW w:type="dxa" w:w="2835"/>
+          </w:tcPr>
+          <w:p>
+            <w:pPr>
+              <w:spacing w:after="0" w:line="240" w:lineRule="auto"/>
+              <w:ind w:firstLine="0"/>
+            </w:pPr>
+            <w:r/>
+            <w:r>
+              <w:rPr>
+                <w:sz w:val="22"/>
+              </w:rPr>
+              <w:t>Розмір збірки armeabi-v7a</w:t>
+            </w:r>
+          </w:p>
+        </w:tc>
+        <w:tc>
+          <w:tcPr>
+            <w:tcW w:type="dxa" w:w="5953"/>
+          </w:tcPr>
+          <w:p>
+            <w:pPr>
+              <w:spacing w:after="0" w:line="240" w:lineRule="auto"/>
+              <w:ind w:firstLine="0"/>
+            </w:pPr>
+            <w:r/>
+            <w:r>
+              <w:rPr>
+                <w:sz w:val="22"/>
+              </w:rPr>
+              <w:t>53,3 МБ</w:t>
+            </w:r>
+          </w:p>
+        </w:tc>
+      </w:tr>
+      <w:tr>
+        <w:tc>
+          <w:tcPr>
+            <w:tcW w:type="dxa" w:w="2835"/>
+          </w:tcPr>
+          <w:p>
+            <w:pPr>
+              <w:spacing w:after="0" w:line="240" w:lineRule="auto"/>
+              <w:ind w:firstLine="0"/>
+            </w:pPr>
+            <w:r/>
+            <w:r>
+              <w:rPr>
+                <w:sz w:val="22"/>
+              </w:rPr>
+              <w:t>Постачальник виконання</w:t>
+            </w:r>
+          </w:p>
+        </w:tc>
+        <w:tc>
+          <w:tcPr>
+            <w:tcW w:type="dxa" w:w="5953"/>
+          </w:tcPr>
+          <w:p>
+            <w:pPr>
+              <w:spacing w:after="0" w:line="240" w:lineRule="auto"/>
+              <w:ind w:firstLine="0"/>
+            </w:pPr>
+            <w:r/>
+            <w:r>
+              <w:rPr>
+                <w:sz w:val="22"/>
+              </w:rPr>
+              <w:t>центральний процесор; NNAPI та XNNPACK доступні, але потребують окремої перевірки</w:t>
+            </w:r>
+          </w:p>
+        </w:tc>
+      </w:tr>
+    </w:tbl>
+    <w:p>
+      <w:pPr>
+        <w:spacing w:after="0"/>
+      </w:pPr>
+    </w:p>
+    <w:p>
+      <w:pPr>
+        <w:spacing w:before="40" w:after="200" w:line="240" w:lineRule="auto"/>
+        <w:ind w:firstLine="0"/>
+      </w:pPr>
+      <w:r>
+        <w:rPr>
+          <w:i/>
+          <w:sz w:val="22"/>
+        </w:rPr>
+        <w:t>Таблиця 11.5 — Характеристики збірки застосунку</w:t>
+      </w:r>
+    </w:p>
+    <w:p>
+      <w:pPr>
+        <w:pStyle w:val="Heading2"/>
+      </w:pPr>
+      <w:r>
+        <w:t>11.5. Обмеження поточної версії</w:t>
+      </w:r>
+    </w:p>
+    <w:p>
+      <w:pPr>
+        <w:pStyle w:val="ListBullet"/>
+      </w:pPr>
+      <w:r>
+        <w:t>приймаються лише зображення PNG та JPEG: файли DICOM набору стиснено методом JPEG Baseline, а доступні бібліотеки мовою Dart читають лише нестиснені та RLE-дані;</w:t>
+      </w:r>
+    </w:p>
+    <w:p>
+      <w:pPr>
+        <w:pStyle w:val="ListBullet"/>
+      </w:pPr>
+      <w:r>
+        <w:t>фотографування знімка з екрана або негатоскопа додає відблиски та геометричні спотворення, яких не було в навчальних даних;</w:t>
+      </w:r>
+    </w:p>
+    <w:p>
+      <w:pPr>
+        <w:pStyle w:val="ListBullet"/>
+      </w:pPr>
+      <w:r>
+        <w:t>карта активацій, обмежувальні рамки, вибір файлів DICOM, квантування та будь-який серверний складник свідомо не входять до цієї версії;</w:t>
+      </w:r>
+    </w:p>
+    <w:p>
+      <w:pPr>
+        <w:pStyle w:val="ListBullet"/>
+      </w:pPr>
+      <w:r>
+        <w:t>ручний сценарій із вибором знімка в галереї перевіряється вручну; автоматизовано лише програмний конвеєр.</w:t>
       </w:r>
     </w:p>
     <w:p>
@@ -11526,9 +13711,17 @@
         <w:br/>
         <w:t>├── models/, services/           моделі даних і служби</w:t>
         <w:br/>
+        <w:t>├── models/model_info.dart       контракт моделі з картки</w:t>
+        <w:br/>
+        <w:t>├── services/image_preprocessor.dart      препроцесинг зображення</w:t>
+        <w:br/>
+        <w:t>├── services/onnx_analysis_service.dart   висновування на пристрої</w:t>
+        <w:br/>
         <w:t>├── screens/                     Home, Analyze, Result, History</w:t>
         <w:br/>
-        <w:t>└── widgets/                     повторно використовувані елементи</w:t>
+        <w:t>├── widgets/                     повторно використовувані елементи</w:t>
+        <w:br/>
+        <w:t>└── assets/models/               pulmonet7m.onnx + model_card.json</w:t>
       </w:r>
     </w:p>
     <w:p>
@@ -12090,6 +14283,82 @@
               <w:rPr>
                 <w:sz w:val="20"/>
               </w:rPr>
+              <w:t>Інтеграційний тест не бачив контрольних знімків на пристрої</w:t>
+            </w:r>
+          </w:p>
+        </w:tc>
+        <w:tc>
+          <w:tcPr>
+            <w:tcW w:type="dxa" w:w="4819"/>
+          </w:tcPr>
+          <w:p>
+            <w:pPr>
+              <w:spacing w:after="0" w:line="240" w:lineRule="auto"/>
+              <w:ind w:firstLine="0"/>
+            </w:pPr>
+            <w:r/>
+            <w:r>
+              <w:rPr>
+                <w:sz w:val="20"/>
+              </w:rPr>
+              <w:t>тіло тесту виконується на смартфоні, тому файли репозиторію недоступні; знімки передаються командою adb у каталог /data/local/tmp, який переживає перевстановлення застосунку</w:t>
+            </w:r>
+          </w:p>
+        </w:tc>
+      </w:tr>
+      <w:tr>
+        <w:tc>
+          <w:tcPr>
+            <w:tcW w:type="dxa" w:w="3969"/>
+          </w:tcPr>
+          <w:p>
+            <w:pPr>
+              <w:spacing w:after="0" w:line="240" w:lineRule="auto"/>
+              <w:ind w:firstLine="0"/>
+            </w:pPr>
+            <w:r/>
+            <w:r>
+              <w:rPr>
+                <w:sz w:val="20"/>
+              </w:rPr>
+              <w:t>Функції бібліотеки обробки зображень не відтворюють препроцесинг навчання</w:t>
+            </w:r>
+          </w:p>
+        </w:tc>
+        <w:tc>
+          <w:tcPr>
+            <w:tcW w:type="dxa" w:w="4819"/>
+          </w:tcPr>
+          <w:p>
+            <w:pPr>
+              <w:spacing w:after="0" w:line="240" w:lineRule="auto"/>
+              <w:ind w:firstLine="0"/>
+            </w:pPr>
+            <w:r/>
+            <w:r>
+              <w:rPr>
+                <w:sz w:val="20"/>
+              </w:rPr>
+              <w:t>звернення до яскравості спотворювало одноканальні зображення, а коробковий фільтр зміщував імовірність до 2,1·10⁻²; трикутний фільтр реалізовано вручну, розбіжність зменшено до 7,9·10⁻⁷</w:t>
+            </w:r>
+          </w:p>
+        </w:tc>
+      </w:tr>
+      <w:tr>
+        <w:tc>
+          <w:tcPr>
+            <w:tcW w:type="dxa" w:w="3969"/>
+          </w:tcPr>
+          <w:p>
+            <w:pPr>
+              <w:spacing w:after="0" w:line="240" w:lineRule="auto"/>
+              <w:ind w:firstLine="0"/>
+            </w:pPr>
+            <w:r/>
+            <w:r>
+              <w:rPr>
+                <w:sz w:val="20"/>
+              </w:rPr>
               <w:t>Збережені тестові прогнози не відтворюються побітово</w:t>
             </w:r>
           </w:p>
@@ -12239,7 +14508,23 @@
         <w:pStyle w:val="ListBullet"/>
       </w:pPr>
       <w:r>
-        <w:t>експорт моделі у формат ONNX із підтвердженою еквівалентністю (розбіжність 1,8·10⁻⁷).</w:t>
+        <w:t>експорт моделі у формат ONNX із підтвердженою еквівалентністю (розбіжність 1,8·10⁻⁷);</w:t>
+      </w:r>
+    </w:p>
+    <w:p>
+      <w:pPr>
+        <w:pStyle w:val="ListBullet"/>
+      </w:pPr>
+      <w:r>
+        <w:t>інтеграція моделі в мобільний застосунок: локальне висновування без сервера, відповідність препроцесингу 7,9·10⁻⁷, 22 автоматичні тести;</w:t>
+      </w:r>
+    </w:p>
+    <w:p>
+      <w:pPr>
+        <w:pStyle w:val="ListBullet"/>
+      </w:pPr>
+      <w:r>
+        <w:t>наскрізна перевірка на смартфоні Android: прогрівання 294 мс, 214 мс на знімок, розбіжність із настільним конвеєром 7,889·10⁻⁷.</w:t>
       </w:r>
     </w:p>
     <w:p>
@@ -12261,7 +14546,15 @@
         <w:pStyle w:val="ListBullet"/>
       </w:pPr>
       <w:r>
-        <w:t>інтеграція експортованої моделі у мобільний застосунок замість імітаційної служби, включно з перенесенням попереднього оброблення та подальшою передачею карти активацій в інтерфейс;</w:t>
+        <w:t>передавання карти активацій в інтерфейс застосунку;</w:t>
+      </w:r>
+    </w:p>
+    <w:p>
+      <w:pPr>
+        <w:pStyle w:val="ListBullet"/>
+      </w:pPr>
+      <w:r>
+        <w:t>підтримка файлів DICOM на пристрої;</w:t>
       </w:r>
     </w:p>
     <w:p>

</xml_diff>

<commit_message>
fix bug with pdf and add safe area
</commit_message>
<xml_diff>
--- a/docs/PulmoAI_materialy_magisterska.docx
+++ b/docs/PulmoAI_materialy_magisterska.docx
@@ -14513,7 +14513,7 @@
           <w:b w:val="0"/>
           <w:i w:val="0"/>
         </w:rPr>
-        <w:t>Для кожного завершеного аналізу застосунок формує односторінковий PDF-звіт: вердикт, ймовірність, поріг, версія моделі, час висновування, вихідний знімок, теплова карта та застереження про те, що результат не є діагнозом. Документ створюється на пристрої з уже збережених даних і передається через стандартне вікно надсилання, тобто подальша доля файлу залишається рішенням користувача.</w:t>
+        <w:t>Для кожного завершеного аналізу застосунок формує односторінковий PDF-звіт: вердикт, ймовірність, поріг, версія моделі, час висновування, вихідний знімок, теплова карта та застереження про те, що результат не є діагнозом. Документ створюється на пристрої з уже збережених даних і передається через стандартне вікно надсилання, тобто подальша доля файлу залишається рішенням користувача. Текст набирається шрифтом Noto Sans (ліцензія SIL OFL), вбудованим у застосунок: стандартні шрифти бібліотеки pdf не містять кирилиці, а завантаження шрифту з мережі суперечило б автономній роботі.</w:t>
       </w:r>
     </w:p>
     <w:p>
@@ -16265,6 +16265,82 @@
                 <w:sz w:val="20"/>
               </w:rPr>
               <w:t>докладний режим показав аварійне завершення процесу тестового середовища з кодом порушення доступу; відтворено приблизно в одному запуску з десяти на мінімальному прикладі, що не містить коду проєкту, тому причина — дефект середовища виконання тестів, а не застосунку; модульні тести не зачеплені</w:t>
+            </w:r>
+          </w:p>
+        </w:tc>
+      </w:tr>
+      <w:tr>
+        <w:tc>
+          <w:tcPr>
+            <w:tcW w:type="dxa" w:w="3969"/>
+          </w:tcPr>
+          <w:p>
+            <w:pPr>
+              <w:spacing w:after="0" w:line="240" w:lineRule="auto"/>
+              <w:ind w:firstLine="0"/>
+            </w:pPr>
+            <w:r/>
+            <w:r>
+              <w:rPr>
+                <w:sz w:val="20"/>
+              </w:rPr>
+              <w:t>PDF-звіт українською мовою містив замість літер порожні прямокутники</w:t>
+            </w:r>
+          </w:p>
+        </w:tc>
+        <w:tc>
+          <w:tcPr>
+            <w:tcW w:type="dxa" w:w="4819"/>
+          </w:tcPr>
+          <w:p>
+            <w:pPr>
+              <w:spacing w:after="0" w:line="240" w:lineRule="auto"/>
+              <w:ind w:firstLine="0"/>
+            </w:pPr>
+            <w:r/>
+            <w:r>
+              <w:rPr>
+                <w:sz w:val="20"/>
+              </w:rPr>
+              <w:t>вбудований шрифт Helvetica бібліотеки pdf охоплює лише Latin-1; до застосунку додано шрифт Noto Sans (звичайний і жирний), а тест перевіряє, що кириличний звіт набрано саме ним</w:t>
+            </w:r>
+          </w:p>
+        </w:tc>
+      </w:tr>
+      <w:tr>
+        <w:tc>
+          <w:tcPr>
+            <w:tcW w:type="dxa" w:w="3969"/>
+          </w:tcPr>
+          <w:p>
+            <w:pPr>
+              <w:spacing w:after="0" w:line="240" w:lineRule="auto"/>
+              <w:ind w:firstLine="0"/>
+            </w:pPr>
+            <w:r/>
+            <w:r>
+              <w:rPr>
+                <w:sz w:val="20"/>
+              </w:rPr>
+              <w:t>На Android 15 нижня частина екранів результату та аналізу заходила під системну панель навігації</w:t>
+            </w:r>
+          </w:p>
+        </w:tc>
+        <w:tc>
+          <w:tcPr>
+            <w:tcW w:type="dxa" w:w="4819"/>
+          </w:tcPr>
+          <w:p>
+            <w:pPr>
+              <w:spacing w:after="0" w:line="240" w:lineRule="auto"/>
+              <w:ind w:firstLine="0"/>
+            </w:pPr>
+            <w:r/>
+            <w:r>
+              <w:rPr>
+                <w:sz w:val="20"/>
+              </w:rPr>
+              <w:t>система примусово вмикає відображення від краю до краю; прокручувані області всіх екранів отримали нижній і бічні відступи за системними вставками</w:t>
             </w:r>
           </w:p>
         </w:tc>

</xml_diff>